<commit_message>
Add FX sensitivity presets and searchable OKX instruments
</commit_message>
<xml_diff>
--- a/docs/久留美桌宠-使用教程.docx
+++ b/docs/久留美桌宠-使用教程.docx
@@ -536,7 +536,34 @@
         <w:t>FX设置…</w:t>
       </w:r>
       <w:r>
-        <w:t>，在"交易对"里填你要看的品种，填法见下表。</w:t>
+        <w:t xml:space="preserve">，找到"交易对"。先选 </w:t>
+      </w:r>
+      <w:r>
+        <w:rPr>
+          <w:b/>
+        </w:rPr>
+        <w:t>现货</w:t>
+      </w:r>
+      <w:r>
+        <w:t xml:space="preserve"> 还是 </w:t>
+      </w:r>
+      <w:r>
+        <w:rPr>
+          <w:b/>
+        </w:rPr>
+        <w:t>永续</w:t>
+      </w:r>
+      <w:r>
+        <w:t xml:space="preserve">。选永续时，程序会自动在后面补上 </w:t>
+      </w:r>
+      <w:r>
+        <w:rPr>
+          <w:rFonts w:ascii="Consolas" w:hAnsi="Consolas"/>
+        </w:rPr>
+        <w:t>-SWAP</w:t>
+      </w:r>
+      <w:r>
+        <w:t>，不用自己写。</w:t>
       </w:r>
     </w:p>
     <w:p>
@@ -544,7 +571,59 @@
         <w:ind w:left="340"/>
       </w:pPr>
       <w:r>
-        <w:t xml:space="preserve">3. 保存后点 </w:t>
+        <w:t xml:space="preserve">3. 在旁边的下拉框里选币种。列表是从欧易拉取的，永续大约 515 个，现货大约 1183 个。刚打开或刚切换现货/永续时，要等 </w:t>
+      </w:r>
+      <w:r>
+        <w:rPr>
+          <w:b/>
+        </w:rPr>
+        <w:t>5～10 秒</w:t>
+      </w:r>
+      <w:r>
+        <w:t xml:space="preserve"> 才加载完。</w:t>
+      </w:r>
+    </w:p>
+    <w:p>
+      <w:pPr>
+        <w:ind w:left="340"/>
+      </w:pPr>
+      <w:r>
+        <w:t xml:space="preserve">4. 下拉框可以直接打字搜索，比如输入 </w:t>
+      </w:r>
+      <w:r>
+        <w:rPr>
+          <w:rFonts w:ascii="Consolas" w:hAnsi="Consolas"/>
+        </w:rPr>
+        <w:t>BTC</w:t>
+      </w:r>
+      <w:r>
+        <w:t xml:space="preserve"> 就能筛出相关的交易对。也可以手动输入完整的交易对，比如 </w:t>
+      </w:r>
+      <w:r>
+        <w:rPr>
+          <w:rFonts w:ascii="Consolas" w:hAnsi="Consolas"/>
+        </w:rPr>
+        <w:t>BTC-USDT</w:t>
+      </w:r>
+      <w:r>
+        <w:t xml:space="preserve">。只输 </w:t>
+      </w:r>
+      <w:r>
+        <w:rPr>
+          <w:rFonts w:ascii="Consolas" w:hAnsi="Consolas"/>
+        </w:rPr>
+        <w:t>BTC</w:t>
+      </w:r>
+      <w:r>
+        <w:t xml:space="preserve"> 这种不完整的写法会有提示，保存不了。</w:t>
+      </w:r>
+    </w:p>
+    <w:p>
+      <w:pPr>
+        <w:ind w:left="340"/>
+      </w:pPr>
+      <w:r>
+        <w:t xml:space="preserve">5. 保存后点 </w:t>
       </w:r>
       <w:r>
         <w:rPr>
@@ -565,6 +644,31 @@
         <w:t>读一次。</w:t>
       </w:r>
     </w:p>
+    <w:p>
+      <w:r>
+        <w:rPr>
+          <w:b/>
+        </w:rPr>
+        <w:t>注意：</w:t>
+      </w:r>
+      <w:r>
+        <w:t xml:space="preserve">交易对选择只在数据源是 </w:t>
+      </w:r>
+      <w:r>
+        <w:rPr>
+          <w:b/>
+        </w:rPr>
+        <w:t>欧易 OKX API</w:t>
+      </w:r>
+      <w:r>
+        <w:t xml:space="preserve"> 时能用。在截图识别模式下它是灰色的，会有提示，这时价格还是读屏幕上框选的数字。</w:t>
+      </w:r>
+    </w:p>
+    <w:p>
+      <w:r>
+        <w:t>交易对的写法可以参考下表：</w:t>
+      </w:r>
+    </w:p>
     <w:tbl>
       <w:tblPr>
         <w:tblStyle w:val="TableGrid"/>
@@ -577,11 +681,17 @@
         <w:gridCol w:w="2880"/>
       </w:tblGrid>
       <w:tr>
+        <w:trPr>
+          <w:cantSplit/>
+        </w:trPr>
         <w:tc>
           <w:tcPr>
             <w:tcW w:type="dxa" w:w="2880"/>
           </w:tcPr>
           <w:p>
+            <w:pPr>
+              <w:keepNext/>
+            </w:pPr>
             <w:r>
               <w:rPr>
                 <w:b/>
@@ -597,13 +707,16 @@
             <w:tcW w:type="dxa" w:w="2880"/>
           </w:tcPr>
           <w:p>
+            <w:pPr>
+              <w:keepNext/>
+            </w:pPr>
             <w:r>
               <w:rPr>
                 <w:b/>
               </w:rPr>
             </w:r>
             <w:r>
-              <w:t>填法</w:t>
+              <w:t>写法</w:t>
             </w:r>
           </w:p>
         </w:tc>
@@ -612,6 +725,9 @@
             <w:tcW w:type="dxa" w:w="2880"/>
           </w:tcPr>
           <w:p>
+            <w:pPr>
+              <w:keepNext/>
+            </w:pPr>
             <w:r>
               <w:rPr>
                 <w:b/>
@@ -624,11 +740,17 @@
         </w:tc>
       </w:tr>
       <w:tr>
+        <w:trPr>
+          <w:cantSplit/>
+        </w:trPr>
         <w:tc>
           <w:tcPr>
             <w:tcW w:type="dxa" w:w="2880"/>
           </w:tcPr>
           <w:p>
+            <w:pPr>
+              <w:keepNext/>
+            </w:pPr>
             <w:r/>
             <w:r>
               <w:t>现货</w:t>
@@ -640,6 +762,9 @@
             <w:tcW w:type="dxa" w:w="2880"/>
           </w:tcPr>
           <w:p>
+            <w:pPr>
+              <w:keepNext/>
+            </w:pPr>
             <w:r/>
             <w:r>
               <w:rPr>
@@ -654,6 +779,9 @@
             <w:tcW w:type="dxa" w:w="2880"/>
           </w:tcPr>
           <w:p>
+            <w:pPr>
+              <w:keepNext/>
+            </w:pPr>
             <w:r/>
             <w:r>
               <w:rPr>
@@ -665,6 +793,9 @@
         </w:tc>
       </w:tr>
       <w:tr>
+        <w:trPr>
+          <w:cantSplit/>
+        </w:trPr>
         <w:tc>
           <w:tcPr>
             <w:tcW w:type="dxa" w:w="2880"/>
@@ -717,12 +848,17 @@
     </w:tbl>
     <w:p>
       <w:pPr>
+        <w:spacing w:after="0"/>
+      </w:pPr>
+    </w:p>
+    <w:p>
+      <w:pPr>
         <w:jc w:val="center"/>
       </w:pPr>
       <w:r>
         <w:drawing>
           <wp:inline xmlns:a="http://schemas.openxmlformats.org/drawingml/2006/main" xmlns:pic="http://schemas.openxmlformats.org/drawingml/2006/picture">
-            <wp:extent cx="3558857" cy="987429"/>
+            <wp:extent cx="3420000" cy="1625143"/>
             <wp:docPr id="7" name="Picture 7"/>
             <wp:cNvGraphicFramePr>
               <a:graphicFrameLocks noChangeAspect="1"/>
@@ -731,7 +867,7 @@
               <a:graphicData uri="http://schemas.openxmlformats.org/drawingml/2006/picture">
                 <pic:pic>
                   <pic:nvPicPr>
-                    <pic:cNvPr id="0" name="c_A_pair.jpg"/>
+                    <pic:cNvPr id="0" name="c_v2_sens_pair.jpg"/>
                     <pic:cNvPicPr/>
                   </pic:nvPicPr>
                   <pic:blipFill>
@@ -743,7 +879,7 @@
                   <pic:spPr>
                     <a:xfrm>
                       <a:off x="0" y="0"/>
-                      <a:ext cx="3558857" cy="987429"/>
+                      <a:ext cx="3420000" cy="1625143"/>
                     </a:xfrm>
                     <a:prstGeom prst="rect"/>
                   </pic:spPr>
@@ -764,7 +900,7 @@
           <w:color w:val="888888"/>
           <w:sz w:val="18"/>
         </w:rPr>
-        <w:t>FX设置里的交易对、模拟盘和两条亏损提醒线</w:t>
+        <w:t>FX设置里的表情灵敏度、市场类型和交易对（下方会显示"已载入 515 个交易对"）</w:t>
       </w:r>
     </w:p>
     <w:p>
@@ -812,11 +948,17 @@
         <w:gridCol w:w="2880"/>
       </w:tblGrid>
       <w:tr>
+        <w:trPr>
+          <w:cantSplit/>
+        </w:trPr>
         <w:tc>
           <w:tcPr>
             <w:tcW w:type="dxa" w:w="2880"/>
           </w:tcPr>
           <w:p>
+            <w:pPr>
+              <w:keepNext/>
+            </w:pPr>
             <w:r>
               <w:rPr>
                 <w:b/>
@@ -832,6 +974,9 @@
             <w:tcW w:type="dxa" w:w="2880"/>
           </w:tcPr>
           <w:p>
+            <w:pPr>
+              <w:keepNext/>
+            </w:pPr>
             <w:r>
               <w:rPr>
                 <w:b/>
@@ -847,6 +992,9 @@
             <w:tcW w:type="dxa" w:w="2880"/>
           </w:tcPr>
           <w:p>
+            <w:pPr>
+              <w:keepNext/>
+            </w:pPr>
             <w:r>
               <w:rPr>
                 <w:b/>
@@ -859,11 +1007,17 @@
         </w:tc>
       </w:tr>
       <w:tr>
+        <w:trPr>
+          <w:cantSplit/>
+        </w:trPr>
         <w:tc>
           <w:tcPr>
             <w:tcW w:type="dxa" w:w="2880"/>
           </w:tcPr>
           <w:p>
+            <w:pPr>
+              <w:keepNext/>
+            </w:pPr>
             <w:r/>
             <w:r>
               <w:t>涨 0.30% 及以上</w:t>
@@ -875,6 +1029,9 @@
             <w:tcW w:type="dxa" w:w="2880"/>
           </w:tcPr>
           <w:p>
+            <w:pPr>
+              <w:keepNext/>
+            </w:pPr>
             <w:r/>
             <w:r>
               <w:t>大涨</w:t>
@@ -886,6 +1043,9 @@
             <w:tcW w:type="dxa" w:w="2880"/>
           </w:tcPr>
           <w:p>
+            <w:pPr>
+              <w:keepNext/>
+            </w:pPr>
             <w:r/>
             <w:r>
               <w:t>星星眼 / 眨眼比耶</w:t>
@@ -894,11 +1054,17 @@
         </w:tc>
       </w:tr>
       <w:tr>
+        <w:trPr>
+          <w:cantSplit/>
+        </w:trPr>
         <w:tc>
           <w:tcPr>
             <w:tcW w:type="dxa" w:w="2880"/>
           </w:tcPr>
           <w:p>
+            <w:pPr>
+              <w:keepNext/>
+            </w:pPr>
             <w:r/>
             <w:r>
               <w:t>涨 0.08% ~ 0.30%</w:t>
@@ -910,6 +1076,9 @@
             <w:tcW w:type="dxa" w:w="2880"/>
           </w:tcPr>
           <w:p>
+            <w:pPr>
+              <w:keepNext/>
+            </w:pPr>
             <w:r/>
             <w:r>
               <w:t>小涨</w:t>
@@ -921,6 +1090,9 @@
             <w:tcW w:type="dxa" w:w="2880"/>
           </w:tcPr>
           <w:p>
+            <w:pPr>
+              <w:keepNext/>
+            </w:pPr>
             <w:r/>
             <w:r>
               <w:t>害羞地想加杠杆</w:t>
@@ -929,11 +1101,17 @@
         </w:tc>
       </w:tr>
       <w:tr>
+        <w:trPr>
+          <w:cantSplit/>
+        </w:trPr>
         <w:tc>
           <w:tcPr>
             <w:tcW w:type="dxa" w:w="2880"/>
           </w:tcPr>
           <w:p>
+            <w:pPr>
+              <w:keepNext/>
+            </w:pPr>
             <w:r/>
             <w:r>
               <w:t>±0.08% 以内</w:t>
@@ -945,6 +1123,9 @@
             <w:tcW w:type="dxa" w:w="2880"/>
           </w:tcPr>
           <w:p>
+            <w:pPr>
+              <w:keepNext/>
+            </w:pPr>
             <w:r/>
             <w:r>
               <w:t>平稳</w:t>
@@ -956,6 +1137,9 @@
             <w:tcW w:type="dxa" w:w="2880"/>
           </w:tcPr>
           <w:p>
+            <w:pPr>
+              <w:keepNext/>
+            </w:pPr>
             <w:r/>
             <w:r>
               <w:t>托腮发呆，连续平稳 5 分钟后睡着</w:t>
@@ -964,11 +1148,17 @@
         </w:tc>
       </w:tr>
       <w:tr>
+        <w:trPr>
+          <w:cantSplit/>
+        </w:trPr>
         <w:tc>
           <w:tcPr>
             <w:tcW w:type="dxa" w:w="2880"/>
           </w:tcPr>
           <w:p>
+            <w:pPr>
+              <w:keepNext/>
+            </w:pPr>
             <w:r/>
             <w:r>
               <w:t>跌 0.08% ~ 0.30%</w:t>
@@ -980,6 +1170,9 @@
             <w:tcW w:type="dxa" w:w="2880"/>
           </w:tcPr>
           <w:p>
+            <w:pPr>
+              <w:keepNext/>
+            </w:pPr>
             <w:r/>
             <w:r>
               <w:t>小跌</w:t>
@@ -991,6 +1184,9 @@
             <w:tcW w:type="dxa" w:w="2880"/>
           </w:tcPr>
           <w:p>
+            <w:pPr>
+              <w:keepNext/>
+            </w:pPr>
             <w:r/>
             <w:r>
               <w:t>思考 / 合十求神</w:t>
@@ -999,11 +1195,17 @@
         </w:tc>
       </w:tr>
       <w:tr>
+        <w:trPr>
+          <w:cantSplit/>
+        </w:trPr>
         <w:tc>
           <w:tcPr>
             <w:tcW w:type="dxa" w:w="2880"/>
           </w:tcPr>
           <w:p>
+            <w:pPr>
+              <w:keepNext/>
+            </w:pPr>
             <w:r/>
             <w:r>
               <w:t>跌 0.30% 及以上</w:t>
@@ -1015,6 +1217,9 @@
             <w:tcW w:type="dxa" w:w="2880"/>
           </w:tcPr>
           <w:p>
+            <w:pPr>
+              <w:keepNext/>
+            </w:pPr>
             <w:r/>
             <w:r>
               <w:t>大跌</w:t>
@@ -1026,6 +1231,9 @@
             <w:tcW w:type="dxa" w:w="2880"/>
           </w:tcPr>
           <w:p>
+            <w:pPr>
+              <w:keepNext/>
+            </w:pPr>
             <w:r/>
             <w:r>
               <w:t>生气 / 手指结界</w:t>
@@ -1034,6 +1242,9 @@
         </w:tc>
       </w:tr>
       <w:tr>
+        <w:trPr>
+          <w:cantSplit/>
+        </w:trPr>
         <w:tc>
           <w:tcPr>
             <w:tcW w:type="dxa" w:w="2880"/>
@@ -1069,6 +1280,25 @@
         </w:tc>
       </w:tr>
     </w:tbl>
+    <w:p>
+      <w:pPr>
+        <w:spacing w:after="0"/>
+      </w:pPr>
+    </w:p>
+    <w:p>
+      <w:r>
+        <w:t xml:space="preserve">上表用的是 </w:t>
+      </w:r>
+      <w:r>
+        <w:rPr>
+          <w:b/>
+        </w:rPr>
+        <w:t>默认</w:t>
+      </w:r>
+      <w:r>
+        <w:t xml:space="preserve"> 灵敏度的数字。灵敏度可以调，见下面"表情灵敏度"。</w:t>
+      </w:r>
+    </w:p>
     <w:p>
       <w:r>
         <w:t>几条规则：</w:t>
@@ -1211,6 +1441,635 @@
     </w:p>
     <w:p>
       <w:pPr>
+        <w:pStyle w:val="Heading2"/>
+      </w:pPr>
+      <w:r>
+        <w:t>表情灵敏度：涨跌多少才换表情</w:t>
+      </w:r>
+    </w:p>
+    <w:p>
+      <w:r>
+        <w:t xml:space="preserve">不同品种波动大小差很多。在 </w:t>
+      </w:r>
+      <w:r>
+        <w:rPr>
+          <w:b/>
+        </w:rPr>
+        <w:t>右键 → FX设置… → 表情灵敏度</w:t>
+      </w:r>
+      <w:r>
+        <w:t xml:space="preserve"> 里可以选一档。三个数字分别是 </w:t>
+      </w:r>
+      <w:r>
+        <w:rPr>
+          <w:b/>
+        </w:rPr>
+        <w:t>横盘 / 强波动 / 恐慌跌幅</w:t>
+      </w:r>
+      <w:r>
+        <w:t xml:space="preserve"> 的百分比：</w:t>
+      </w:r>
+    </w:p>
+    <w:tbl>
+      <w:tblPr>
+        <w:tblStyle w:val="TableGrid"/>
+        <w:tblW w:type="auto" w:w="0"/>
+        <w:tblLook w:firstColumn="1" w:firstRow="1" w:lastColumn="0" w:lastRow="0" w:noHBand="0" w:noVBand="1" w:val="04A0"/>
+      </w:tblPr>
+      <w:tblGrid>
+        <w:gridCol w:w="1728"/>
+        <w:gridCol w:w="1728"/>
+        <w:gridCol w:w="1728"/>
+        <w:gridCol w:w="1728"/>
+        <w:gridCol w:w="1728"/>
+      </w:tblGrid>
+      <w:tr>
+        <w:trPr>
+          <w:cantSplit/>
+        </w:trPr>
+        <w:tc>
+          <w:tcPr>
+            <w:tcW w:type="dxa" w:w="1728"/>
+          </w:tcPr>
+          <w:p>
+            <w:pPr>
+              <w:keepNext/>
+            </w:pPr>
+            <w:r>
+              <w:rPr>
+                <w:b/>
+              </w:rPr>
+            </w:r>
+            <w:r>
+              <w:t>档位</w:t>
+            </w:r>
+          </w:p>
+        </w:tc>
+        <w:tc>
+          <w:tcPr>
+            <w:tcW w:type="dxa" w:w="1728"/>
+          </w:tcPr>
+          <w:p>
+            <w:pPr>
+              <w:keepNext/>
+            </w:pPr>
+            <w:r>
+              <w:rPr>
+                <w:b/>
+              </w:rPr>
+            </w:r>
+            <w:r>
+              <w:t>横盘</w:t>
+            </w:r>
+          </w:p>
+        </w:tc>
+        <w:tc>
+          <w:tcPr>
+            <w:tcW w:type="dxa" w:w="1728"/>
+          </w:tcPr>
+          <w:p>
+            <w:pPr>
+              <w:keepNext/>
+            </w:pPr>
+            <w:r>
+              <w:rPr>
+                <w:b/>
+              </w:rPr>
+            </w:r>
+            <w:r>
+              <w:t>强波动</w:t>
+            </w:r>
+          </w:p>
+        </w:tc>
+        <w:tc>
+          <w:tcPr>
+            <w:tcW w:type="dxa" w:w="1728"/>
+          </w:tcPr>
+          <w:p>
+            <w:pPr>
+              <w:keepNext/>
+            </w:pPr>
+            <w:r>
+              <w:rPr>
+                <w:b/>
+              </w:rPr>
+            </w:r>
+            <w:r>
+              <w:t>恐慌跌幅</w:t>
+            </w:r>
+          </w:p>
+        </w:tc>
+        <w:tc>
+          <w:tcPr>
+            <w:tcW w:type="dxa" w:w="1728"/>
+          </w:tcPr>
+          <w:p>
+            <w:pPr>
+              <w:keepNext/>
+            </w:pPr>
+            <w:r>
+              <w:rPr>
+                <w:b/>
+              </w:rPr>
+            </w:r>
+            <w:r>
+              <w:t>适合</w:t>
+            </w:r>
+          </w:p>
+        </w:tc>
+      </w:tr>
+      <w:tr>
+        <w:trPr>
+          <w:cantSplit/>
+        </w:trPr>
+        <w:tc>
+          <w:tcPr>
+            <w:tcW w:type="dxa" w:w="1728"/>
+          </w:tcPr>
+          <w:p>
+            <w:pPr>
+              <w:keepNext/>
+            </w:pPr>
+            <w:r/>
+            <w:r>
+              <w:t>外汇股票</w:t>
+            </w:r>
+          </w:p>
+        </w:tc>
+        <w:tc>
+          <w:tcPr>
+            <w:tcW w:type="dxa" w:w="1728"/>
+          </w:tcPr>
+          <w:p>
+            <w:pPr>
+              <w:keepNext/>
+            </w:pPr>
+            <w:r/>
+            <w:r>
+              <w:t>0.05%</w:t>
+            </w:r>
+          </w:p>
+        </w:tc>
+        <w:tc>
+          <w:tcPr>
+            <w:tcW w:type="dxa" w:w="1728"/>
+          </w:tcPr>
+          <w:p>
+            <w:pPr>
+              <w:keepNext/>
+            </w:pPr>
+            <w:r/>
+            <w:r>
+              <w:t>0.20%</w:t>
+            </w:r>
+          </w:p>
+        </w:tc>
+        <w:tc>
+          <w:tcPr>
+            <w:tcW w:type="dxa" w:w="1728"/>
+          </w:tcPr>
+          <w:p>
+            <w:pPr>
+              <w:keepNext/>
+            </w:pPr>
+            <w:r/>
+            <w:r>
+              <w:t>2%</w:t>
+            </w:r>
+          </w:p>
+        </w:tc>
+        <w:tc>
+          <w:tcPr>
+            <w:tcW w:type="dxa" w:w="1728"/>
+          </w:tcPr>
+          <w:p>
+            <w:pPr>
+              <w:keepNext/>
+            </w:pPr>
+            <w:r/>
+            <w:r>
+              <w:t>波动小的市场，比如外汇、股票</w:t>
+            </w:r>
+          </w:p>
+        </w:tc>
+      </w:tr>
+      <w:tr>
+        <w:trPr>
+          <w:cantSplit/>
+        </w:trPr>
+        <w:tc>
+          <w:tcPr>
+            <w:tcW w:type="dxa" w:w="1728"/>
+          </w:tcPr>
+          <w:p>
+            <w:pPr>
+              <w:keepNext/>
+            </w:pPr>
+            <w:r/>
+            <w:r>
+              <w:t>默认</w:t>
+            </w:r>
+          </w:p>
+        </w:tc>
+        <w:tc>
+          <w:tcPr>
+            <w:tcW w:type="dxa" w:w="1728"/>
+          </w:tcPr>
+          <w:p>
+            <w:pPr>
+              <w:keepNext/>
+            </w:pPr>
+            <w:r/>
+            <w:r>
+              <w:t>0.08%</w:t>
+            </w:r>
+          </w:p>
+        </w:tc>
+        <w:tc>
+          <w:tcPr>
+            <w:tcW w:type="dxa" w:w="1728"/>
+          </w:tcPr>
+          <w:p>
+            <w:pPr>
+              <w:keepNext/>
+            </w:pPr>
+            <w:r/>
+            <w:r>
+              <w:t>0.30%</w:t>
+            </w:r>
+          </w:p>
+        </w:tc>
+        <w:tc>
+          <w:tcPr>
+            <w:tcW w:type="dxa" w:w="1728"/>
+          </w:tcPr>
+          <w:p>
+            <w:pPr>
+              <w:keepNext/>
+            </w:pPr>
+            <w:r/>
+            <w:r>
+              <w:t>3%</w:t>
+            </w:r>
+          </w:p>
+        </w:tc>
+        <w:tc>
+          <w:tcPr>
+            <w:tcW w:type="dxa" w:w="1728"/>
+          </w:tcPr>
+          <w:p>
+            <w:pPr>
+              <w:keepNext/>
+            </w:pPr>
+            <w:r/>
+            <w:r>
+              <w:t>大多数情况，不知道选什么就用它</w:t>
+            </w:r>
+          </w:p>
+        </w:tc>
+      </w:tr>
+      <w:tr>
+        <w:trPr>
+          <w:cantSplit/>
+        </w:trPr>
+        <w:tc>
+          <w:tcPr>
+            <w:tcW w:type="dxa" w:w="1728"/>
+          </w:tcPr>
+          <w:p>
+            <w:pPr>
+              <w:keepNext/>
+            </w:pPr>
+            <w:r/>
+            <w:r>
+              <w:t>加密货币</w:t>
+            </w:r>
+          </w:p>
+        </w:tc>
+        <w:tc>
+          <w:tcPr>
+            <w:tcW w:type="dxa" w:w="1728"/>
+          </w:tcPr>
+          <w:p>
+            <w:pPr>
+              <w:keepNext/>
+            </w:pPr>
+            <w:r/>
+            <w:r>
+              <w:t>0.15%</w:t>
+            </w:r>
+          </w:p>
+        </w:tc>
+        <w:tc>
+          <w:tcPr>
+            <w:tcW w:type="dxa" w:w="1728"/>
+          </w:tcPr>
+          <w:p>
+            <w:pPr>
+              <w:keepNext/>
+            </w:pPr>
+            <w:r/>
+            <w:r>
+              <w:t>0.60%</w:t>
+            </w:r>
+          </w:p>
+        </w:tc>
+        <w:tc>
+          <w:tcPr>
+            <w:tcW w:type="dxa" w:w="1728"/>
+          </w:tcPr>
+          <w:p>
+            <w:pPr>
+              <w:keepNext/>
+            </w:pPr>
+            <w:r/>
+            <w:r>
+              <w:t>5%</w:t>
+            </w:r>
+          </w:p>
+        </w:tc>
+        <w:tc>
+          <w:tcPr>
+            <w:tcW w:type="dxa" w:w="1728"/>
+          </w:tcPr>
+          <w:p>
+            <w:pPr>
+              <w:keepNext/>
+            </w:pPr>
+            <w:r/>
+            <w:r>
+              <w:t>波动大的币，避免她一直大惊小怪</w:t>
+            </w:r>
+          </w:p>
+        </w:tc>
+      </w:tr>
+      <w:tr>
+        <w:trPr>
+          <w:cantSplit/>
+        </w:trPr>
+        <w:tc>
+          <w:tcPr>
+            <w:tcW w:type="dxa" w:w="1728"/>
+          </w:tcPr>
+          <w:p>
+            <w:r/>
+            <w:r>
+              <w:t>自定义</w:t>
+            </w:r>
+          </w:p>
+        </w:tc>
+        <w:tc>
+          <w:tcPr>
+            <w:tcW w:type="dxa" w:w="1728"/>
+          </w:tcPr>
+          <w:p>
+            <w:r/>
+            <w:r>
+              <w:t>自己填</w:t>
+            </w:r>
+          </w:p>
+        </w:tc>
+        <w:tc>
+          <w:tcPr>
+            <w:tcW w:type="dxa" w:w="1728"/>
+          </w:tcPr>
+          <w:p>
+            <w:r/>
+            <w:r>
+              <w:t>自己填</w:t>
+            </w:r>
+          </w:p>
+        </w:tc>
+        <w:tc>
+          <w:tcPr>
+            <w:tcW w:type="dxa" w:w="1728"/>
+          </w:tcPr>
+          <w:p>
+            <w:r/>
+            <w:r>
+              <w:t>自己填</w:t>
+            </w:r>
+          </w:p>
+        </w:tc>
+        <w:tc>
+          <w:tcPr>
+            <w:tcW w:type="dxa" w:w="1728"/>
+          </w:tcPr>
+          <w:p>
+            <w:r/>
+            <w:r>
+              <w:t>想自己调的时候</w:t>
+            </w:r>
+          </w:p>
+        </w:tc>
+      </w:tr>
+    </w:tbl>
+    <w:p>
+      <w:pPr>
+        <w:spacing w:after="0"/>
+      </w:pPr>
+    </w:p>
+    <w:p>
+      <w:pPr>
+        <w:jc w:val="center"/>
+      </w:pPr>
+      <w:r>
+        <w:drawing>
+          <wp:inline xmlns:a="http://schemas.openxmlformats.org/drawingml/2006/main" xmlns:pic="http://schemas.openxmlformats.org/drawingml/2006/picture">
+            <wp:extent cx="3420000" cy="997714"/>
+            <wp:docPr id="8" name="Picture 8"/>
+            <wp:cNvGraphicFramePr>
+              <a:graphicFrameLocks noChangeAspect="1"/>
+            </wp:cNvGraphicFramePr>
+            <a:graphic>
+              <a:graphicData uri="http://schemas.openxmlformats.org/drawingml/2006/picture">
+                <pic:pic>
+                  <pic:nvPicPr>
+                    <pic:cNvPr id="0" name="c_v2_sens_dropdown.jpg"/>
+                    <pic:cNvPicPr/>
+                  </pic:nvPicPr>
+                  <pic:blipFill>
+                    <a:blip r:embed="rId16"/>
+                    <a:stretch>
+                      <a:fillRect/>
+                    </a:stretch>
+                  </pic:blipFill>
+                  <pic:spPr>
+                    <a:xfrm>
+                      <a:off x="0" y="0"/>
+                      <a:ext cx="3420000" cy="997714"/>
+                    </a:xfrm>
+                    <a:prstGeom prst="rect"/>
+                  </pic:spPr>
+                </pic:pic>
+              </a:graphicData>
+            </a:graphic>
+          </wp:inline>
+        </w:drawing>
+      </w:r>
+    </w:p>
+    <w:p>
+      <w:pPr>
+        <w:jc w:val="center"/>
+      </w:pPr>
+      <w:r>
+        <w:rPr>
+          <w:i/>
+          <w:color w:val="888888"/>
+          <w:sz w:val="18"/>
+        </w:rPr>
+        <w:t>点开"表情灵敏度"下拉框选择档位</w:t>
+      </w:r>
+    </w:p>
+    <w:p>
+      <w:pPr>
+        <w:pStyle w:val="ListBullet"/>
+      </w:pPr>
+      <w:r>
+        <w:rPr>
+          <w:b/>
+        </w:rPr>
+        <w:t>横盘</w:t>
+      </w:r>
+      <w:r>
+        <w:t>：30 秒内涨跌超过这个数，才算小涨或小跌，否则托腮发呆。</w:t>
+      </w:r>
+    </w:p>
+    <w:p>
+      <w:pPr>
+        <w:pStyle w:val="ListBullet"/>
+      </w:pPr>
+      <w:r>
+        <w:rPr>
+          <w:b/>
+        </w:rPr>
+        <w:t>强波动</w:t>
+      </w:r>
+      <w:r>
+        <w:t>：超过这个数，算大涨或大跌。</w:t>
+      </w:r>
+    </w:p>
+    <w:p>
+      <w:pPr>
+        <w:pStyle w:val="ListBullet"/>
+      </w:pPr>
+      <w:r>
+        <w:rPr>
+          <w:b/>
+        </w:rPr>
+        <w:t>恐慌跌幅</w:t>
+      </w:r>
+      <w:r>
+        <w:t>：30 秒或 2 分钟内跌超这个数，进入恐慌。</w:t>
+      </w:r>
+    </w:p>
+    <w:p>
+      <w:r>
+        <w:t>怎么选：</w:t>
+      </w:r>
+    </w:p>
+    <w:p>
+      <w:pPr>
+        <w:ind w:left="340"/>
+      </w:pPr>
+      <w:r>
+        <w:t xml:space="preserve">1. 先用 </w:t>
+      </w:r>
+      <w:r>
+        <w:rPr>
+          <w:b/>
+        </w:rPr>
+        <w:t>默认</w:t>
+      </w:r>
+      <w:r>
+        <w:t>。</w:t>
+      </w:r>
+    </w:p>
+    <w:p>
+      <w:pPr>
+        <w:ind w:left="340"/>
+      </w:pPr>
+      <w:r>
+        <w:t xml:space="preserve">2. 如果她一直在大涨大跌之间乱跳，换成 </w:t>
+      </w:r>
+      <w:r>
+        <w:rPr>
+          <w:b/>
+        </w:rPr>
+        <w:t>加密货币</w:t>
+      </w:r>
+      <w:r>
+        <w:t>。</w:t>
+      </w:r>
+    </w:p>
+    <w:p>
+      <w:pPr>
+        <w:ind w:left="340"/>
+      </w:pPr>
+      <w:r>
+        <w:t xml:space="preserve">3. 如果她一直发呆、几乎不换表情，换成 </w:t>
+      </w:r>
+      <w:r>
+        <w:rPr>
+          <w:b/>
+        </w:rPr>
+        <w:t>外汇股票</w:t>
+      </w:r>
+      <w:r>
+        <w:t>。</w:t>
+      </w:r>
+    </w:p>
+    <w:p>
+      <w:r>
+        <w:rPr>
+          <w:b/>
+        </w:rPr>
+        <w:t>自定义：</w:t>
+      </w:r>
+      <w:r>
+        <w:t xml:space="preserve">选"自定义"后会出现三个输入框，最多显示两位小数，比如 </w:t>
+      </w:r>
+      <w:r>
+        <w:rPr>
+          <w:rFonts w:ascii="Consolas" w:hAnsi="Consolas"/>
+        </w:rPr>
+        <w:t>0.08 %</w:t>
+      </w:r>
+      <w:r>
+        <w:t xml:space="preserve">。三个数必须满足 </w:t>
+      </w:r>
+      <w:r>
+        <w:rPr>
+          <w:b/>
+        </w:rPr>
+        <w:t>横盘 &lt; 强波动 &lt; 恐慌跌幅</w:t>
+      </w:r>
+      <w:r>
+        <w:t xml:space="preserve">，不满足时输入框会标红，也保存不了。填乱了可以点 </w:t>
+      </w:r>
+      <w:r>
+        <w:rPr>
+          <w:b/>
+        </w:rPr>
+        <w:t>恢复默认</w:t>
+      </w:r>
+      <w:r>
+        <w:t>。回到平稳的"退出线"会按比例自动算好，不用自己填。</w:t>
+      </w:r>
+    </w:p>
+    <w:p>
+      <w:r>
+        <w:rPr>
+          <w:b/>
+        </w:rPr>
+        <w:t>改完立刻生效：</w:t>
+      </w:r>
+      <w:r>
+        <w:t>不用重启，也不会重新预热，已经读到的价格会保留。</w:t>
+      </w:r>
+    </w:p>
+    <w:p>
+      <w:pPr>
         <w:pStyle w:val="Heading1"/>
       </w:pPr>
       <w:r>
@@ -1238,8 +2097,8 @@
       <w:r>
         <w:drawing>
           <wp:inline xmlns:a="http://schemas.openxmlformats.org/drawingml/2006/main" xmlns:pic="http://schemas.openxmlformats.org/drawingml/2006/picture">
-            <wp:extent cx="3759428" cy="4613142"/>
-            <wp:docPr id="8" name="Picture 8"/>
+            <wp:extent cx="3641142" cy="4062856"/>
+            <wp:docPr id="9" name="Picture 9"/>
             <wp:cNvGraphicFramePr>
               <a:graphicFrameLocks noChangeAspect="1"/>
             </wp:cNvGraphicFramePr>
@@ -1247,11 +2106,11 @@
               <a:graphicData uri="http://schemas.openxmlformats.org/drawingml/2006/picture">
                 <pic:pic>
                   <pic:nvPicPr>
-                    <pic:cNvPr id="0" name="c_dialog_full.jpg"/>
+                    <pic:cNvPr id="0" name="c_v2_dialog_full.jpg"/>
                     <pic:cNvPicPr/>
                   </pic:nvPicPr>
                   <pic:blipFill>
-                    <a:blip r:embed="rId16"/>
+                    <a:blip r:embed="rId17"/>
                     <a:stretch>
                       <a:fillRect/>
                     </a:stretch>
@@ -1259,7 +2118,7 @@
                   <pic:spPr>
                     <a:xfrm>
                       <a:off x="0" y="0"/>
-                      <a:ext cx="3759428" cy="4613142"/>
+                      <a:ext cx="3641142" cy="4062856"/>
                     </a:xfrm>
                     <a:prstGeom prst="rect"/>
                   </pic:spPr>
@@ -1280,7 +2139,7 @@
           <w:color w:val="888888"/>
           <w:sz w:val="18"/>
         </w:rPr>
-        <w:t>完整的 FX设置窗口</w:t>
+        <w:t>完整的 FX设置窗口（下方的密钥栏未显示，见第五节）</w:t>
       </w:r>
     </w:p>
     <w:p>
@@ -1414,7 +2273,7 @@
         <w:drawing>
           <wp:inline xmlns:a="http://schemas.openxmlformats.org/drawingml/2006/main" xmlns:pic="http://schemas.openxmlformats.org/drawingml/2006/picture">
             <wp:extent cx="5400000" cy="3848354"/>
-            <wp:docPr id="9" name="Picture 9"/>
+            <wp:docPr id="10" name="Picture 10"/>
             <wp:cNvGraphicFramePr>
               <a:graphicFrameLocks noChangeAspect="1"/>
             </wp:cNvGraphicFramePr>
@@ -1426,7 +2285,7 @@
                     <pic:cNvPicPr/>
                   </pic:nvPicPr>
                   <pic:blipFill>
-                    <a:blip r:embed="rId17"/>
+                    <a:blip r:embed="rId18"/>
                     <a:stretch>
                       <a:fillRect/>
                     </a:stretch>
@@ -1507,7 +2366,7 @@
         <w:drawing>
           <wp:inline xmlns:a="http://schemas.openxmlformats.org/drawingml/2006/main" xmlns:pic="http://schemas.openxmlformats.org/drawingml/2006/picture">
             <wp:extent cx="3558857" cy="730286"/>
-            <wp:docPr id="10" name="Picture 10"/>
+            <wp:docPr id="11" name="Picture 11"/>
             <wp:cNvGraphicFramePr>
               <a:graphicFrameLocks noChangeAspect="1"/>
             </wp:cNvGraphicFramePr>
@@ -1519,7 +2378,7 @@
                     <pic:cNvPicPr/>
                   </pic:nvPicPr>
                   <pic:blipFill>
-                    <a:blip r:embed="rId18"/>
+                    <a:blip r:embed="rId19"/>
                     <a:stretch>
                       <a:fillRect/>
                     </a:stretch>
@@ -1755,6 +2614,150 @@
     <w:p>
       <w:r>
         <w:t>检查网络。部分地区的网络访问欧易会受限，可以先用截图识别。</w:t>
+      </w:r>
+    </w:p>
+    <w:p>
+      <w:r>
+        <w:rPr>
+          <w:b/>
+        </w:rPr>
+        <w:t>Q：交易对的下拉框是灰的，点不了？</w:t>
+      </w:r>
+    </w:p>
+    <w:p>
+      <w:r>
+        <w:t xml:space="preserve">现在的数据源是截图识别。交易对选择只在 </w:t>
+      </w:r>
+      <w:r>
+        <w:rPr>
+          <w:b/>
+        </w:rPr>
+        <w:t>欧易 OKX API</w:t>
+      </w:r>
+      <w:r>
+        <w:t xml:space="preserve"> 下能用。右键 → 行情数据源 → 选 </w:t>
+      </w:r>
+      <w:r>
+        <w:rPr>
+          <w:b/>
+        </w:rPr>
+        <w:t>欧易 OKX API</w:t>
+      </w:r>
+      <w:r>
+        <w:t xml:space="preserve"> 就可以了。</w:t>
+      </w:r>
+    </w:p>
+    <w:p>
+      <w:r>
+        <w:rPr>
+          <w:b/>
+        </w:rPr>
+        <w:t>Q：交易对列表是空的，或者加载很慢？</w:t>
+      </w:r>
+    </w:p>
+    <w:p>
+      <w:pPr>
+        <w:pStyle w:val="ListBullet"/>
+      </w:pPr>
+      <w:r>
+        <w:t xml:space="preserve">刚打开设置或刚切换现货/永续时，列表要等 </w:t>
+      </w:r>
+      <w:r>
+        <w:rPr>
+          <w:b/>
+        </w:rPr>
+        <w:t>5～10 秒</w:t>
+      </w:r>
+      <w:r>
+        <w:t xml:space="preserve"> 才加载完，稍等一下。</w:t>
+      </w:r>
+    </w:p>
+    <w:p>
+      <w:pPr>
+        <w:pStyle w:val="ListBullet"/>
+      </w:pPr>
+      <w:r>
+        <w:t xml:space="preserve">如果一直是空的，可能是网络连不上欧易。可以直接手动输入完整交易对，比如 </w:t>
+      </w:r>
+      <w:r>
+        <w:rPr>
+          <w:rFonts w:ascii="Consolas" w:hAnsi="Consolas"/>
+        </w:rPr>
+        <w:t>BTC-USDT</w:t>
+      </w:r>
+      <w:r>
+        <w:t xml:space="preserve"> 或 </w:t>
+      </w:r>
+      <w:r>
+        <w:rPr>
+          <w:rFonts w:ascii="Consolas" w:hAnsi="Consolas"/>
+        </w:rPr>
+        <w:t>BTC-USDT-SWAP</w:t>
+      </w:r>
+      <w:r>
+        <w:t>。</w:t>
+      </w:r>
+    </w:p>
+    <w:p>
+      <w:r>
+        <w:rPr>
+          <w:b/>
+        </w:rPr>
+        <w:t>Q：换了交易对以后，她又从头开始预热了？</w:t>
+      </w:r>
+    </w:p>
+    <w:p>
+      <w:r>
+        <w:t>这是正常的。换交易对会清空之前的价格，重新预热，保证新旧品种的价格不会混在一起算。只调灵敏度不会这样。</w:t>
+      </w:r>
+    </w:p>
+    <w:p>
+      <w:r>
+        <w:rPr>
+          <w:b/>
+        </w:rPr>
+        <w:t>Q：自定义灵敏度保存不了，输入框是红的？</w:t>
+      </w:r>
+    </w:p>
+    <w:p>
+      <w:r>
+        <w:t xml:space="preserve">三个数要满足 </w:t>
+      </w:r>
+      <w:r>
+        <w:rPr>
+          <w:b/>
+        </w:rPr>
+        <w:t>横盘 &lt; 强波动 &lt; 恐慌跌幅</w:t>
+      </w:r>
+      <w:r>
+        <w:t xml:space="preserve">，比如 </w:t>
+      </w:r>
+      <w:r>
+        <w:rPr>
+          <w:rFonts w:ascii="Consolas" w:hAnsi="Consolas"/>
+        </w:rPr>
+        <w:t>0.10 / 0.40 / 4</w:t>
+      </w:r>
+      <w:r>
+        <w:t xml:space="preserve"> 可以，</w:t>
+      </w:r>
+      <w:r>
+        <w:rPr>
+          <w:rFonts w:ascii="Consolas" w:hAnsi="Consolas"/>
+        </w:rPr>
+        <w:t>0.50 / 0.30 / 4</w:t>
+      </w:r>
+      <w:r>
+        <w:t xml:space="preserve"> 就不行。改对了红框会消失。实在不行就点 </w:t>
+      </w:r>
+      <w:r>
+        <w:rPr>
+          <w:b/>
+        </w:rPr>
+        <w:t>恢复默认</w:t>
+      </w:r>
+      <w:r>
+        <w:t>。</w:t>
       </w:r>
     </w:p>
     <w:sectPr>

</xml_diff>

<commit_message>
Fix OCR selection, numeric settings and pet occlusion checks
</commit_message>
<xml_diff>
--- a/docs/久留美桌宠-使用教程.docx
+++ b/docs/久留美桌宠-使用教程.docx
@@ -344,7 +344,16 @@
         <w:t>FX启动！</w:t>
       </w:r>
       <w:r>
-        <w:t>。第一次使用时会弹出框选，拖动鼠标框住</w:t>
+        <w:t>。</w:t>
+      </w:r>
+      <w:r>
+        <w:rPr>
+          <w:b/>
+        </w:rPr>
+        <w:t>每次打开 FX 都会弹出框选</w:t>
+      </w:r>
+      <w:r>
+        <w:t>，拖动鼠标框住</w:t>
       </w:r>
       <w:r>
         <w:rPr>
@@ -353,7 +362,7 @@
         <w:t>一个完整的价格数字</w:t>
       </w:r>
       <w:r>
-        <w:t>。四周稍微留一点边，不要框进品种名、涨跌幅或其他数字。按 Esc 或右键可以取消。</w:t>
+        <w:t>。四周稍微留一点边，不要框进品种名、涨跌幅或其他数字。</w:t>
       </w:r>
     </w:p>
     <w:p>
@@ -361,7 +370,24 @@
         <w:ind w:left="340"/>
       </w:pPr>
       <w:r>
-        <w:t xml:space="preserve">4. 之后她每 </w:t>
+        <w:t>4. 按 Esc 或右键可以取消框选，</w:t>
+      </w:r>
+      <w:r>
+        <w:rPr>
+          <w:b/>
+        </w:rPr>
+        <w:t>取消后 FX 不会启动</w:t>
+      </w:r>
+      <w:r>
+        <w:t>。</w:t>
+      </w:r>
+    </w:p>
+    <w:p>
+      <w:pPr>
+        <w:ind w:left="340"/>
+      </w:pPr>
+      <w:r>
+        <w:t xml:space="preserve">5. 框好以后，她每 </w:t>
       </w:r>
       <w:r>
         <w:rPr>
@@ -370,16 +396,32 @@
         <w:t>3 秒</w:t>
       </w:r>
       <w:r>
-        <w:t xml:space="preserve">看一次价格，约 10 秒后开始换表情。框选好的区域会被记住。如果换了品种，或者移动、缩放了看盘窗口，需要在 </w:t>
+        <w:t>看一次价格，约 10 秒后开始换表情。</w:t>
+      </w:r>
+    </w:p>
+    <w:p>
+      <w:pPr>
+        <w:ind w:left="340"/>
+      </w:pPr>
+      <w:r>
+        <w:t xml:space="preserve">6. 如果换了品种，或者移动、缩放了看盘窗口：右键 → 再点一次 </w:t>
       </w:r>
       <w:r>
         <w:rPr>
           <w:b/>
         </w:rPr>
-        <w:t>FX设置… → 重新框选价格区域</w:t>
+        <w:t>FX启动！</w:t>
       </w:r>
       <w:r>
-        <w:t xml:space="preserve"> 里重新框一次。</w:t>
+        <w:t xml:space="preserve"> 把它关掉，然后重新打开，重新框一次就行。</w:t>
+      </w:r>
+    </w:p>
+    <w:p>
+      <w:pPr>
+        <w:ind w:left="340"/>
+      </w:pPr>
+      <w:r>
+        <w:t>7. 框选时把久留美挪开一点，别让她或她的对话气泡盖住价格，不然会弹出"挡住价格"的提醒。</w:t>
       </w:r>
     </w:p>
     <w:p>
@@ -494,7 +536,7 @@
         <w:t>说明：</w:t>
       </w:r>
       <w:r>
-        <w:t>识别全程在你的电脑本地完成，截图不保存、不上传。开着 FX 的时候，她不会出现在你的截图和录屏里，这样她就不会挡住价格。</w:t>
+        <w:t>识别全程在你的电脑本地完成，截图不保存、不上传。开着 FX 的时候，她不会出现在你的截图和录屏里。</w:t>
       </w:r>
     </w:p>
     <w:p>
@@ -911,7 +953,34 @@
         <w:t>网络不稳时：</w:t>
       </w:r>
       <w:r>
-        <w:t>接口连续失败 3 次，她会说"欸？行情连不上了……"，然后自动切换到截图识别（前提是之前框选过区域），之后每 30 秒重试一次，网络恢复后自动切回 API。</w:t>
+        <w:t>接口连续失败 3 次，她会说"欸？行情连不上了……"，然后自动切换到截图识别。这时</w:t>
+      </w:r>
+      <w:r>
+        <w:rPr>
+          <w:b/>
+        </w:rPr>
+        <w:t>不会弹出框选</w:t>
+      </w:r>
+      <w:r>
+        <w:t xml:space="preserve">，而是直接用你最近一次保存的价格区域。如果没有可用的区域，她会提示区域无效，暂时不读截图，这时需要你自己右键 → 行情数据源 → 选 </w:t>
+      </w:r>
+      <w:r>
+        <w:rPr>
+          <w:b/>
+        </w:rPr>
+        <w:t>截图识别</w:t>
+      </w:r>
+      <w:r>
+        <w:t xml:space="preserve">，再点 </w:t>
+      </w:r>
+      <w:r>
+        <w:rPr>
+          <w:b/>
+        </w:rPr>
+        <w:t>FX启动！</w:t>
+      </w:r>
+      <w:r>
+        <w:t xml:space="preserve"> 重新框选。后台每 30 秒会重试一次欧易，网络恢复后自动切回 API。</w:t>
       </w:r>
     </w:p>
     <w:p>
@@ -1380,7 +1449,7 @@
         <w:t>会重新预热的情况</w:t>
       </w:r>
       <w:r>
-        <w:t>：切换数据源（包括网络不好自动切换）、修改交易对、切换实盘和模拟盘、重新框选，或者连续 30 秒以上没读到价格。</w:t>
+        <w:t>：切换数据源（包括网络不好自动切换）、修改交易对、切换实盘和模拟盘，或者连续 30 秒以上没读到价格。</w:t>
       </w:r>
     </w:p>
     <w:p>
@@ -2045,17 +2114,221 @@
         <w:t>横盘 &lt; 强波动 &lt; 恐慌跌幅</w:t>
       </w:r>
       <w:r>
-        <w:t xml:space="preserve">，不满足时输入框会标红，也保存不了。填乱了可以点 </w:t>
+        <w:t>，不满足时输入框会标红，也保存不了。回到平稳的"退出线"会按比例自动算好，不用自己填。</w:t>
+      </w:r>
+    </w:p>
+    <w:p>
+      <w:r>
+        <w:rPr>
+          <w:b/>
+        </w:rPr>
+        <w:t>改数字的方法：</w:t>
+      </w:r>
+      <w:r>
+        <w:t>FX设置里的数字框（三个灵敏度数字和两条 3% 提醒线）</w:t>
       </w:r>
       <w:r>
         <w:rPr>
           <w:b/>
         </w:rPr>
-        <w:t>恢复默认</w:t>
+        <w:t>不能用鼠标滚轮改</w:t>
       </w:r>
       <w:r>
-        <w:t>。回到平稳的"退出线"会按比例自动算好，不用自己填。</w:t>
+        <w:t>，这样滚动页面时不会误改。请直接输入数字，或者点框右边的上下箭头。</w:t>
       </w:r>
+    </w:p>
+    <w:p>
+      <w:r>
+        <w:rPr>
+          <w:b/>
+        </w:rPr>
+        <w:t>两个恢复按钮：</w:t>
+      </w:r>
+      <w:r>
+        <w:t xml:space="preserve">填乱了可以用下面两个按钮。点完以后都要再点 </w:t>
+      </w:r>
+      <w:r>
+        <w:rPr>
+          <w:b/>
+        </w:rPr>
+        <w:t>保存</w:t>
+      </w:r>
+      <w:r>
+        <w:t xml:space="preserve"> 才生效。</w:t>
+      </w:r>
+    </w:p>
+    <w:tbl>
+      <w:tblPr>
+        <w:tblStyle w:val="TableGrid"/>
+        <w:tblW w:type="auto" w:w="0"/>
+        <w:tblLook w:firstColumn="1" w:firstRow="1" w:lastColumn="0" w:lastRow="0" w:noHBand="0" w:noVBand="1" w:val="04A0"/>
+      </w:tblPr>
+      <w:tblGrid>
+        <w:gridCol w:w="2880"/>
+        <w:gridCol w:w="2880"/>
+        <w:gridCol w:w="2880"/>
+      </w:tblGrid>
+      <w:tr>
+        <w:trPr>
+          <w:cantSplit/>
+        </w:trPr>
+        <w:tc>
+          <w:tcPr>
+            <w:tcW w:type="dxa" w:w="2880"/>
+          </w:tcPr>
+          <w:p>
+            <w:pPr>
+              <w:keepNext/>
+            </w:pPr>
+            <w:r>
+              <w:rPr>
+                <w:b/>
+              </w:rPr>
+            </w:r>
+            <w:r>
+              <w:t>按钮</w:t>
+            </w:r>
+          </w:p>
+        </w:tc>
+        <w:tc>
+          <w:tcPr>
+            <w:tcW w:type="dxa" w:w="2880"/>
+          </w:tcPr>
+          <w:p>
+            <w:pPr>
+              <w:keepNext/>
+            </w:pPr>
+            <w:r>
+              <w:rPr>
+                <w:b/>
+              </w:rPr>
+            </w:r>
+            <w:r>
+              <w:t>位置</w:t>
+            </w:r>
+          </w:p>
+        </w:tc>
+        <w:tc>
+          <w:tcPr>
+            <w:tcW w:type="dxa" w:w="2880"/>
+          </w:tcPr>
+          <w:p>
+            <w:pPr>
+              <w:keepNext/>
+            </w:pPr>
+            <w:r>
+              <w:rPr>
+                <w:b/>
+              </w:rPr>
+            </w:r>
+            <w:r>
+              <w:t>会恢复什么</w:t>
+            </w:r>
+          </w:p>
+        </w:tc>
+      </w:tr>
+      <w:tr>
+        <w:trPr>
+          <w:cantSplit/>
+        </w:trPr>
+        <w:tc>
+          <w:tcPr>
+            <w:tcW w:type="dxa" w:w="2880"/>
+          </w:tcPr>
+          <w:p>
+            <w:pPr>
+              <w:keepNext/>
+            </w:pPr>
+            <w:r/>
+            <w:r>
+              <w:rPr>
+                <w:b/>
+              </w:rPr>
+              <w:t>恢复默认</w:t>
+            </w:r>
+          </w:p>
+        </w:tc>
+        <w:tc>
+          <w:tcPr>
+            <w:tcW w:type="dxa" w:w="2880"/>
+          </w:tcPr>
+          <w:p>
+            <w:pPr>
+              <w:keepNext/>
+            </w:pPr>
+            <w:r/>
+            <w:r>
+              <w:t>"表情灵敏度"下拉框右边</w:t>
+            </w:r>
+          </w:p>
+        </w:tc>
+        <w:tc>
+          <w:tcPr>
+            <w:tcW w:type="dxa" w:w="2880"/>
+          </w:tcPr>
+          <w:p>
+            <w:pPr>
+              <w:keepNext/>
+            </w:pPr>
+            <w:r/>
+            <w:r>
+              <w:t>只把表情灵敏度恢复成"默认"档</w:t>
+            </w:r>
+          </w:p>
+        </w:tc>
+      </w:tr>
+      <w:tr>
+        <w:trPr>
+          <w:cantSplit/>
+        </w:trPr>
+        <w:tc>
+          <w:tcPr>
+            <w:tcW w:type="dxa" w:w="2880"/>
+          </w:tcPr>
+          <w:p>
+            <w:r/>
+            <w:r>
+              <w:rPr>
+                <w:b/>
+              </w:rPr>
+              <w:t>恢复数值默认</w:t>
+            </w:r>
+          </w:p>
+        </w:tc>
+        <w:tc>
+          <w:tcPr>
+            <w:tcW w:type="dxa" w:w="2880"/>
+          </w:tcPr>
+          <w:p>
+            <w:r/>
+            <w:r>
+              <w:t>窗口最下面，隐私说明下方、保存/取消上方</w:t>
+            </w:r>
+          </w:p>
+        </w:tc>
+        <w:tc>
+          <w:tcPr>
+            <w:tcW w:type="dxa" w:w="2880"/>
+          </w:tcPr>
+          <w:p>
+            <w:r/>
+            <w:r>
+              <w:t>表情灵敏度恢复成"默认"档，持仓浮亏提醒线和今日亏损线恢复成 3%，并</w:t>
+            </w:r>
+            <w:r>
+              <w:rPr>
+                <w:b/>
+              </w:rPr>
+              <w:t>清空手动填的止损价</w:t>
+            </w:r>
+          </w:p>
+        </w:tc>
+      </w:tr>
+    </w:tbl>
+    <w:p>
+      <w:pPr>
+        <w:spacing w:after="0"/>
+      </w:pPr>
     </w:p>
     <w:p>
       <w:r>
@@ -2087,59 +2360,16 @@
         <w:t>止损价</w:t>
       </w:r>
       <w:r>
-        <w:t>：在 FX设置… 里填一个价格，跌破时她会切到恐慌表情，喊"该止损了……真的要止损吗？"。不填就是关闭。</w:t>
+        <w:t xml:space="preserve">：在 FX设置… 里填一个价格，跌破时她会切到恐慌表情，喊"该止损了……真的要止损吗？"。不填就是关闭。窗口最下面的 </w:t>
       </w:r>
-    </w:p>
-    <w:p>
-      <w:pPr>
-        <w:jc w:val="center"/>
-      </w:pPr>
-      <w:r>
-        <w:drawing>
-          <wp:inline xmlns:a="http://schemas.openxmlformats.org/drawingml/2006/main" xmlns:pic="http://schemas.openxmlformats.org/drawingml/2006/picture">
-            <wp:extent cx="3641142" cy="4062856"/>
-            <wp:docPr id="9" name="Picture 9"/>
-            <wp:cNvGraphicFramePr>
-              <a:graphicFrameLocks noChangeAspect="1"/>
-            </wp:cNvGraphicFramePr>
-            <a:graphic>
-              <a:graphicData uri="http://schemas.openxmlformats.org/drawingml/2006/picture">
-                <pic:pic>
-                  <pic:nvPicPr>
-                    <pic:cNvPr id="0" name="c_v2_dialog_full.jpg"/>
-                    <pic:cNvPicPr/>
-                  </pic:nvPicPr>
-                  <pic:blipFill>
-                    <a:blip r:embed="rId17"/>
-                    <a:stretch>
-                      <a:fillRect/>
-                    </a:stretch>
-                  </pic:blipFill>
-                  <pic:spPr>
-                    <a:xfrm>
-                      <a:off x="0" y="0"/>
-                      <a:ext cx="3641142" cy="4062856"/>
-                    </a:xfrm>
-                    <a:prstGeom prst="rect"/>
-                  </pic:spPr>
-                </pic:pic>
-              </a:graphicData>
-            </a:graphic>
-          </wp:inline>
-        </w:drawing>
-      </w:r>
-    </w:p>
-    <w:p>
-      <w:pPr>
-        <w:jc w:val="center"/>
-      </w:pPr>
       <w:r>
         <w:rPr>
-          <w:i/>
-          <w:color w:val="888888"/>
-          <w:sz w:val="18"/>
+          <w:b/>
         </w:rPr>
-        <w:t>完整的 FX设置窗口（下方的密钥栏未显示，见第五节）</w:t>
+        <w:t>恢复数值默认</w:t>
+      </w:r>
+      <w:r>
+        <w:t xml:space="preserve"> 也会把它清空（点完要再点保存）。</w:t>
       </w:r>
     </w:p>
     <w:p>
@@ -2168,6 +2398,58 @@
       </w:r>
       <w:r>
         <w:t>：关掉 FX启动！ 时，她会用一句话总结今天的涨跌。这是以今天首次读到的价格为基准算的，不是交易所公布的日涨跌。</w:t>
+      </w:r>
+    </w:p>
+    <w:p>
+      <w:pPr>
+        <w:jc w:val="center"/>
+      </w:pPr>
+      <w:r>
+        <w:drawing>
+          <wp:inline xmlns:a="http://schemas.openxmlformats.org/drawingml/2006/main" xmlns:pic="http://schemas.openxmlformats.org/drawingml/2006/picture">
+            <wp:extent cx="3291428" cy="4510285"/>
+            <wp:docPr id="9" name="Picture 9"/>
+            <wp:cNvGraphicFramePr>
+              <a:graphicFrameLocks noChangeAspect="1"/>
+            </wp:cNvGraphicFramePr>
+            <a:graphic>
+              <a:graphicData uri="http://schemas.openxmlformats.org/drawingml/2006/picture">
+                <pic:pic>
+                  <pic:nvPicPr>
+                    <pic:cNvPr id="0" name="c_v3_dialog_full.jpg"/>
+                    <pic:cNvPicPr/>
+                  </pic:nvPicPr>
+                  <pic:blipFill>
+                    <a:blip r:embed="rId17"/>
+                    <a:stretch>
+                      <a:fillRect/>
+                    </a:stretch>
+                  </pic:blipFill>
+                  <pic:spPr>
+                    <a:xfrm>
+                      <a:off x="0" y="0"/>
+                      <a:ext cx="3291428" cy="4510285"/>
+                    </a:xfrm>
+                    <a:prstGeom prst="rect"/>
+                  </pic:spPr>
+                </pic:pic>
+              </a:graphicData>
+            </a:graphic>
+          </wp:inline>
+        </w:drawing>
+      </w:r>
+    </w:p>
+    <w:p>
+      <w:pPr>
+        <w:jc w:val="center"/>
+      </w:pPr>
+      <w:r>
+        <w:rPr>
+          <w:i/>
+          <w:color w:val="888888"/>
+          <w:sz w:val="18"/>
+        </w:rPr>
+        <w:t>完整的 FX设置窗口（中间的密钥栏未显示，见第五节；最下面是"恢复数值默认"和保存/取消）</w:t>
       </w:r>
     </w:p>
     <w:p>
@@ -2555,7 +2837,7 @@
         <w:pStyle w:val="ListBullet"/>
       </w:pPr>
       <w:r>
-        <w:t>截图模式下识别失败：右键菜单里可以看到最新价格。如果一直没有价格，或者价格不对，就重新框选，只框价格数字。</w:t>
+        <w:t>截图模式下识别失败：右键菜单里可以看到最新价格。如果一直没有价格，或者价格不对，就关掉 FX启动！ 再重新打开，重新框一次，只框价格数字。</w:t>
       </w:r>
     </w:p>
     <w:p>
@@ -2600,7 +2882,64 @@
     </w:p>
     <w:p>
       <w:r>
-        <w:t>确保价格清楚可见，没有被遮挡，字不要太小。不要框进逗号以外的其他符号或文字。看盘窗口移动或缩放后要重新框选。</w:t>
+        <w:t>确保价格清楚可见，没有被遮挡，字不要太小。不要框进逗号以外的其他符号或文字。看盘窗口移动或缩放后，关掉 FX启动！ 再重新打开，重新框一次。</w:t>
+      </w:r>
+    </w:p>
+    <w:p>
+      <w:r>
+        <w:rPr>
+          <w:b/>
+        </w:rPr>
+        <w:t>Q：为什么每次打开 FX 都要框选？取消了就启动不了？</w:t>
+      </w:r>
+    </w:p>
+    <w:p>
+      <w:r>
+        <w:t xml:space="preserve">截图识别模式下，现在的规则就是每次打开 FX 都要重新框一次价格。取消框选，FX 就不会启动，再点一次 </w:t>
+      </w:r>
+      <w:r>
+        <w:rPr>
+          <w:b/>
+        </w:rPr>
+        <w:t>FX启动！</w:t>
+      </w:r>
+      <w:r>
+        <w:t xml:space="preserve"> 重新框就行。用欧易 OKX API 的话不需要框选。</w:t>
+      </w:r>
+    </w:p>
+    <w:p>
+      <w:r>
+        <w:rPr>
+          <w:b/>
+        </w:rPr>
+        <w:t>Q：提示"桌宠挡住价格"？</w:t>
+      </w:r>
+    </w:p>
+    <w:p>
+      <w:r>
+        <w:t>只有她本人或她的对话气泡</w:t>
+      </w:r>
+      <w:r>
+        <w:rPr>
+          <w:b/>
+        </w:rPr>
+        <w:t>真的盖住了框选的价格</w:t>
+      </w:r>
+      <w:r>
+        <w:t>时才会提示，她周围透明的空白不算。多显示器和系统缩放下也能正确判断。把她拖到别的地方，别压在价格上就好。</w:t>
+      </w:r>
+    </w:p>
+    <w:p>
+      <w:r>
+        <w:rPr>
+          <w:b/>
+        </w:rPr>
+        <w:t>Q：滚轮改不了 FX设置 里的数字？</w:t>
+      </w:r>
+    </w:p>
+    <w:p>
+      <w:r>
+        <w:t>这是故意的，防止滚动页面时误改。请直接输入数字，或者点右边的上下箭头。</w:t>
       </w:r>
     </w:p>
     <w:p>
@@ -2748,7 +3087,7 @@
         <w:t>0.50 / 0.30 / 4</w:t>
       </w:r>
       <w:r>
-        <w:t xml:space="preserve"> 就不行。改对了红框会消失。实在不行就点 </w:t>
+        <w:t xml:space="preserve"> 就不行。改对了红框会消失。实在不行就点"表情灵敏度"右边的 </w:t>
       </w:r>
       <w:r>
         <w:rPr>
@@ -2757,7 +3096,25 @@
         <w:t>恢复默认</w:t>
       </w:r>
       <w:r>
-        <w:t>。</w:t>
+        <w:t xml:space="preserve">，只会把灵敏度恢复成"默认"档，然后点 </w:t>
+      </w:r>
+      <w:r>
+        <w:rPr>
+          <w:b/>
+        </w:rPr>
+        <w:t>保存</w:t>
+      </w:r>
+      <w:r>
+        <w:t xml:space="preserve">。（窗口最下面的 </w:t>
+      </w:r>
+      <w:r>
+        <w:rPr>
+          <w:b/>
+        </w:rPr>
+        <w:t>恢复数值默认</w:t>
+      </w:r>
+      <w:r>
+        <w:t xml:space="preserve"> 也行，但它还会把两条 3% 提醒线恢复成默认，并清空手动填的止损价。）</w:t>
       </w:r>
     </w:p>
     <w:sectPr>

</xml_diff>

<commit_message>
Release v1.2.0: XPERP, automatic updates and volume control
</commit_message>
<xml_diff>
--- a/docs/久留美桌宠-使用教程.docx
+++ b/docs/久留美桌宠-使用教程.docx
@@ -56,7 +56,16 @@
         <w:ind w:left="340"/>
       </w:pPr>
       <w:r>
-        <w:t>3. 左键点她，会随机换一个表情，冒出一句台词，还有音效，4 秒后变回挥手。</w:t>
+        <w:t xml:space="preserve">3. 左键点她，会随机换一个表情，冒出一句台词，还有音效，4 秒后变回挥手。音效默认音量是 30%，可以在 </w:t>
+      </w:r>
+      <w:r>
+        <w:rPr>
+          <w:b/>
+        </w:rPr>
+        <w:t>FX设置…</w:t>
+      </w:r>
+      <w:r>
+        <w:t xml:space="preserve"> 里调（见第三节"音效音量"）。</w:t>
       </w:r>
     </w:p>
     <w:p>
@@ -69,6 +78,7 @@
     </w:p>
     <w:p>
       <w:pPr>
+        <w:keepNext/>
         <w:jc w:val="center"/>
       </w:pPr>
       <w:r>
@@ -121,6 +131,7 @@
     </w:p>
     <w:p>
       <w:pPr>
+        <w:keepNext/>
         <w:jc w:val="center"/>
       </w:pPr>
       <w:r>
@@ -173,6 +184,7 @@
     </w:p>
     <w:p>
       <w:pPr>
+        <w:keepNext/>
         <w:jc w:val="center"/>
       </w:pPr>
       <w:r>
@@ -225,6 +237,7 @@
     </w:p>
     <w:p>
       <w:pPr>
+        <w:keepNext/>
         <w:jc w:val="center"/>
       </w:pPr>
       <w:r>
@@ -426,6 +439,7 @@
     </w:p>
     <w:p>
       <w:pPr>
+        <w:keepNext/>
         <w:jc w:val="center"/>
       </w:pPr>
       <w:r>
@@ -478,6 +492,7 @@
     </w:p>
     <w:p>
       <w:pPr>
+        <w:keepNext/>
         <w:jc w:val="center"/>
       </w:pPr>
       <w:r>
@@ -578,8 +593,13 @@
         <w:t>FX设置…</w:t>
       </w:r>
       <w:r>
-        <w:t xml:space="preserve">，找到"交易对"。先选 </w:t>
-      </w:r>
+        <w:t>，在"市场类型"里三选一：</w:t>
+      </w:r>
+    </w:p>
+    <w:p>
+      <w:pPr>
+        <w:pStyle w:val="ListBullet"/>
+      </w:pPr>
       <w:r>
         <w:rPr>
           <w:b/>
@@ -587,8 +607,22 @@
         <w:t>现货</w:t>
       </w:r>
       <w:r>
-        <w:t xml:space="preserve"> 还是 </w:t>
-      </w:r>
+        <w:t xml:space="preserve">：比如 </w:t>
+      </w:r>
+      <w:r>
+        <w:rPr>
+          <w:rFonts w:ascii="Consolas" w:hAnsi="Consolas"/>
+        </w:rPr>
+        <w:t>BTC-USDT</w:t>
+      </w:r>
+      <w:r>
+        <w:t>。</w:t>
+      </w:r>
+    </w:p>
+    <w:p>
+      <w:pPr>
+        <w:pStyle w:val="ListBullet"/>
+      </w:pPr>
       <w:r>
         <w:rPr>
           <w:b/>
@@ -596,7 +630,7 @@
         <w:t>永续</w:t>
       </w:r>
       <w:r>
-        <w:t xml:space="preserve">。选永续时，程序会自动在后面补上 </w:t>
+        <w:t xml:space="preserve">：程序会自动在后面补上 </w:t>
       </w:r>
       <w:r>
         <w:rPr>
@@ -610,10 +644,33 @@
     </w:p>
     <w:p>
       <w:pPr>
+        <w:pStyle w:val="ListBullet"/>
+      </w:pPr>
+      <w:r>
+        <w:rPr>
+          <w:b/>
+        </w:rPr>
+        <w:t>XPERP</w:t>
+      </w:r>
+      <w:r>
+        <w:t>：欧易的一类合约，在欧易接口里归在交割合约（FUTURES）这一类。代码长这样：</w:t>
+      </w:r>
+      <w:r>
+        <w:rPr>
+          <w:rFonts w:ascii="Consolas" w:hAnsi="Consolas"/>
+        </w:rPr>
+        <w:t>IRYS-USD_UM_XPERP-310530</w:t>
+      </w:r>
+      <w:r>
+        <w:t>。这一项不会自动补任何后缀，要用完整代码。</w:t>
+      </w:r>
+    </w:p>
+    <w:p>
+      <w:pPr>
         <w:ind w:left="340"/>
       </w:pPr>
       <w:r>
-        <w:t xml:space="preserve">3. 在旁边的下拉框里选币种。列表是从欧易拉取的，永续大约 515 个，现货大约 1183 个。刚打开或刚切换现货/永续时，要等 </w:t>
+        <w:t xml:space="preserve">3. 在"交易对"下拉框里选币种。列表是从欧易拉取的，永续大约 515 个，现货大约 1183 个，XPERP 大约 250 个（以实际加载为准）。刚打开或刚切换市场类型时，要等 </w:t>
       </w:r>
       <w:r>
         <w:rPr>
@@ -639,7 +696,15 @@
         <w:t>BTC</w:t>
       </w:r>
       <w:r>
-        <w:t xml:space="preserve"> 就能筛出相关的交易对。也可以手动输入完整的交易对，比如 </w:t>
+        <w:t xml:space="preserve"> 就能筛出相关的交易对。也可以手动输入完整的交易对：</w:t>
+      </w:r>
+    </w:p>
+    <w:p>
+      <w:pPr>
+        <w:pStyle w:val="ListBullet"/>
+      </w:pPr>
+      <w:r>
+        <w:t xml:space="preserve">现货、永续：输入 </w:t>
       </w:r>
       <w:r>
         <w:rPr>
@@ -648,7 +713,7 @@
         <w:t>BTC-USDT</w:t>
       </w:r>
       <w:r>
-        <w:t xml:space="preserve">。只输 </w:t>
+        <w:t xml:space="preserve"> 这样的写法。只输 </w:t>
       </w:r>
       <w:r>
         <w:rPr>
@@ -662,6 +727,37 @@
     </w:p>
     <w:p>
       <w:pPr>
+        <w:pStyle w:val="ListBullet"/>
+      </w:pPr>
+      <w:r>
+        <w:t xml:space="preserve">XPERP：必须输入完整代码，格式是 </w:t>
+      </w:r>
+      <w:r>
+        <w:rPr>
+          <w:rFonts w:ascii="Consolas" w:hAnsi="Consolas"/>
+        </w:rPr>
+        <w:t>币种-USD_UM_XPERP-6位数字</w:t>
+      </w:r>
+      <w:r>
+        <w:t xml:space="preserve">，比如 </w:t>
+      </w:r>
+      <w:r>
+        <w:rPr>
+          <w:rFonts w:ascii="Consolas" w:hAnsi="Consolas"/>
+        </w:rPr>
+        <w:t>IRYS-USD_UM_XPERP-310530</w:t>
+      </w:r>
+      <w:r>
+        <w:t>，大小写都行。少一段或数字不是 6 位都会有提示，保存不了。</w:t>
+      </w:r>
+    </w:p>
+    <w:p>
+      <w:r>
+        <w:t>下拉框下面的"实际品种"会显示最终要读的代码，保存前可以看一眼对不对。</w:t>
+      </w:r>
+    </w:p>
+    <w:p>
+      <w:pPr>
         <w:ind w:left="340"/>
       </w:pPr>
       <w:r>
@@ -703,10 +799,22 @@
         <w:t>欧易 OKX API</w:t>
       </w:r>
       <w:r>
-        <w:t xml:space="preserve"> 时能用。在截图识别模式下它是灰色的，会有提示，这时价格还是读屏幕上框选的数字。</w:t>
+        <w:t xml:space="preserve"> 时能用。数据源要在 </w:t>
+      </w:r>
+      <w:r>
+        <w:rPr>
+          <w:b/>
+        </w:rPr>
+        <w:t>右键 → 行情数据源</w:t>
+      </w:r>
+      <w:r>
+        <w:t xml:space="preserve"> 里切换，FX设置 里没有这个选项。在截图识别模式下它是灰色的，会有提示，这时价格还是读屏幕上框选的数字。</w:t>
       </w:r>
     </w:p>
     <w:p>
+      <w:pPr>
+        <w:keepNext/>
+      </w:pPr>
       <w:r>
         <w:t>交易对的写法可以参考下表：</w:t>
       </w:r>
@@ -843,6 +951,9 @@
             <w:tcW w:type="dxa" w:w="2880"/>
           </w:tcPr>
           <w:p>
+            <w:pPr>
+              <w:keepNext/>
+            </w:pPr>
             <w:r/>
             <w:r>
               <w:t>永续合约</w:t>
@@ -854,6 +965,9 @@
             <w:tcW w:type="dxa" w:w="2880"/>
           </w:tcPr>
           <w:p>
+            <w:pPr>
+              <w:keepNext/>
+            </w:pPr>
             <w:r/>
             <w:r>
               <w:rPr>
@@ -868,6 +982,9 @@
             <w:tcW w:type="dxa" w:w="2880"/>
           </w:tcPr>
           <w:p>
+            <w:pPr>
+              <w:keepNext/>
+            </w:pPr>
             <w:r/>
             <w:r>
               <w:rPr>
@@ -887,6 +1004,59 @@
           </w:p>
         </w:tc>
       </w:tr>
+      <w:tr>
+        <w:trPr>
+          <w:cantSplit/>
+        </w:trPr>
+        <w:tc>
+          <w:tcPr>
+            <w:tcW w:type="dxa" w:w="2880"/>
+          </w:tcPr>
+          <w:p>
+            <w:r/>
+            <w:r>
+              <w:t>XPERP</w:t>
+            </w:r>
+          </w:p>
+        </w:tc>
+        <w:tc>
+          <w:tcPr>
+            <w:tcW w:type="dxa" w:w="2880"/>
+          </w:tcPr>
+          <w:p>
+            <w:r/>
+            <w:r>
+              <w:rPr>
+                <w:rFonts w:ascii="Consolas" w:hAnsi="Consolas"/>
+              </w:rPr>
+              <w:t>币种-USD_UM_XPERP-6位数字</w:t>
+            </w:r>
+          </w:p>
+        </w:tc>
+        <w:tc>
+          <w:tcPr>
+            <w:tcW w:type="dxa" w:w="2880"/>
+          </w:tcPr>
+          <w:p>
+            <w:r/>
+            <w:r>
+              <w:rPr>
+                <w:rFonts w:ascii="Consolas" w:hAnsi="Consolas"/>
+              </w:rPr>
+              <w:t>IRYS-USD_UM_XPERP-310530</w:t>
+            </w:r>
+            <w:r>
+              <w:t>、</w:t>
+            </w:r>
+            <w:r>
+              <w:rPr>
+                <w:rFonts w:ascii="Consolas" w:hAnsi="Consolas"/>
+              </w:rPr>
+              <w:t>BTC-USD_UM_XPERP-310404</w:t>
+            </w:r>
+          </w:p>
+        </w:tc>
+      </w:tr>
     </w:tbl>
     <w:p>
       <w:pPr>
@@ -895,12 +1065,13 @@
     </w:p>
     <w:p>
       <w:pPr>
+        <w:keepNext/>
         <w:jc w:val="center"/>
       </w:pPr>
       <w:r>
         <w:drawing>
           <wp:inline xmlns:a="http://schemas.openxmlformats.org/drawingml/2006/main" xmlns:pic="http://schemas.openxmlformats.org/drawingml/2006/picture">
-            <wp:extent cx="3420000" cy="1625143"/>
+            <wp:extent cx="3471428" cy="730286"/>
             <wp:docPr id="7" name="Picture 7"/>
             <wp:cNvGraphicFramePr>
               <a:graphicFrameLocks noChangeAspect="1"/>
@@ -909,7 +1080,7 @@
               <a:graphicData uri="http://schemas.openxmlformats.org/drawingml/2006/picture">
                 <pic:pic>
                   <pic:nvPicPr>
-                    <pic:cNvPr id="0" name="c_v2_sens_pair.jpg"/>
+                    <pic:cNvPr id="0" name="c_v120_pair_select.jpg"/>
                     <pic:cNvPicPr/>
                   </pic:nvPicPr>
                   <pic:blipFill>
@@ -921,7 +1092,7 @@
                   <pic:spPr>
                     <a:xfrm>
                       <a:off x="0" y="0"/>
-                      <a:ext cx="3420000" cy="1625143"/>
+                      <a:ext cx="3471428" cy="730286"/>
                     </a:xfrm>
                     <a:prstGeom prst="rect"/>
                   </pic:spPr>
@@ -942,7 +1113,7 @@
           <w:color w:val="888888"/>
           <w:sz w:val="18"/>
         </w:rPr>
-        <w:t>FX设置里的表情灵敏度、市场类型和交易对（下方会显示"已载入 515 个交易对"）</w:t>
+        <w:t>FX设置里的市场类型和交易对（下方会显示"实际品种"和"已载入 515 个交易对"）</w:t>
       </w:r>
     </w:p>
     <w:p>
@@ -992,6 +1163,9 @@
       </w:r>
     </w:p>
     <w:p>
+      <w:pPr>
+        <w:keepNext/>
+      </w:pPr>
       <w:r>
         <w:t>她主要看</w:t>
       </w:r>
@@ -1477,7 +1651,25 @@
         <w:t>音效</w:t>
       </w:r>
       <w:r>
-        <w:t>：换成上涨表情时播放开心音效，换成下跌表情时播放沮丧音效，平稳和睡觉时不出声。右键可以静音。</w:t>
+        <w:t xml:space="preserve">：换成上涨表情时播放开心音效，换成下跌表情时播放沮丧音效，平稳和睡觉时不出声。音量在 </w:t>
+      </w:r>
+      <w:r>
+        <w:rPr>
+          <w:b/>
+        </w:rPr>
+        <w:t>FX设置… → 音效音量</w:t>
+      </w:r>
+      <w:r>
+        <w:t xml:space="preserve"> 里调，默认 30%；右键菜单里的 </w:t>
+      </w:r>
+      <w:r>
+        <w:rPr>
+          <w:b/>
+        </w:rPr>
+        <w:t>静音</w:t>
+      </w:r>
+      <w:r>
+        <w:t xml:space="preserve"> 照常可用。</w:t>
       </w:r>
     </w:p>
     <w:p>
@@ -1517,6 +1709,9 @@
       </w:r>
     </w:p>
     <w:p>
+      <w:pPr>
+        <w:keepNext/>
+      </w:pPr>
       <w:r>
         <w:t xml:space="preserve">不同品种波动大小差很多。在 </w:t>
       </w:r>
@@ -1940,6 +2135,7 @@
     </w:p>
     <w:p>
       <w:pPr>
+        <w:keepNext/>
         <w:jc w:val="center"/>
       </w:pPr>
       <w:r>
@@ -2125,7 +2321,7 @@
         <w:t>改数字的方法：</w:t>
       </w:r>
       <w:r>
-        <w:t>FX设置里的数字框（三个灵敏度数字和两条 3% 提醒线）</w:t>
+        <w:t>FX设置里的数字框（三个灵敏度数字和两条 3% 提醒线）和音量滑块都</w:t>
       </w:r>
       <w:r>
         <w:rPr>
@@ -2138,6 +2334,9 @@
       </w:r>
     </w:p>
     <w:p>
+      <w:pPr>
+        <w:keepNext/>
+      </w:pPr>
       <w:r>
         <w:rPr>
           <w:b/>
@@ -2313,7 +2512,7 @@
           <w:p>
             <w:r/>
             <w:r>
-              <w:t>表情灵敏度恢复成"默认"档，持仓浮亏提醒线和今日亏损线恢复成 3%，并</w:t>
+              <w:t>表情灵敏度恢复成"默认"档，音效音量恢复成 30%，持仓浮亏提醒线和今日亏损线恢复成 3%，并</w:t>
             </w:r>
             <w:r>
               <w:rPr>
@@ -2321,6 +2520,9 @@
               </w:rPr>
               <w:t>清空手动填的止损价</w:t>
             </w:r>
+            <w:r>
+              <w:t>。交易对和密钥不变</w:t>
+            </w:r>
           </w:p>
         </w:tc>
       </w:tr>
@@ -2343,71 +2545,130 @@
     </w:p>
     <w:p>
       <w:pPr>
-        <w:pStyle w:val="Heading1"/>
-      </w:pPr>
-      <w:r>
-        <w:t>四、风控小助手</w:t>
+        <w:pStyle w:val="Heading2"/>
+      </w:pPr>
+      <w:r>
+        <w:t>音效音量</w:t>
       </w:r>
     </w:p>
     <w:p>
-      <w:pPr>
-        <w:pStyle w:val="ListBullet"/>
-      </w:pPr>
+      <w:r>
+        <w:t xml:space="preserve">在 </w:t>
+      </w:r>
       <w:r>
         <w:rPr>
           <w:b/>
         </w:rPr>
-        <w:t>止损价</w:t>
-      </w:r>
-      <w:r>
-        <w:t xml:space="preserve">：在 FX设置… 里填一个价格，跌破时她会切到恐慌表情，喊"该止损了……真的要止损吗？"。不填就是关闭。窗口最下面的 </w:t>
+        <w:t>FX设置…</w:t>
+      </w:r>
+      <w:r>
+        <w:t xml:space="preserve"> 里，"表情灵敏度"下面有一个 </w:t>
       </w:r>
       <w:r>
         <w:rPr>
           <w:b/>
         </w:rPr>
-        <w:t>恢复数值默认</w:t>
-      </w:r>
-      <w:r>
-        <w:t xml:space="preserve"> 也会把它清空（点完要再点保存）。</w:t>
-      </w:r>
-    </w:p>
-    <w:p>
-      <w:pPr>
-        <w:pStyle w:val="ListBullet"/>
-      </w:pPr>
+        <w:t>音效音量</w:t>
+      </w:r>
+      <w:r>
+        <w:t xml:space="preserve"> 滑块，默认 </w:t>
+      </w:r>
       <w:r>
         <w:rPr>
           <w:b/>
         </w:rPr>
-        <w:t>休息提醒</w:t>
-      </w:r>
-      <w:r>
-        <w:t>：连续盯盘 1 小时，她会劝你休息一下。</w:t>
+        <w:t>30%</w:t>
+      </w:r>
+      <w:r>
+        <w:t>，管的是她所有的音效（点击、开心、沮丧）。</w:t>
       </w:r>
     </w:p>
     <w:p>
       <w:pPr>
-        <w:pStyle w:val="ListBullet"/>
-      </w:pPr>
+        <w:ind w:left="340"/>
+      </w:pPr>
+      <w:r>
+        <w:t>1. 拖动滑块，音量</w:t>
+      </w:r>
       <w:r>
         <w:rPr>
           <w:b/>
         </w:rPr>
-        <w:t>今日总结</w:t>
-      </w:r>
-      <w:r>
-        <w:t>：关掉 FX启动！ 时，她会用一句话总结今天的涨跌。这是以今天首次读到的价格为基准算的，不是交易所公布的日涨跌。</w:t>
+        <w:t>马上就变</w:t>
+      </w:r>
+      <w:r>
+        <w:t>，右边会显示百分比。</w:t>
       </w:r>
     </w:p>
     <w:p>
       <w:pPr>
+        <w:ind w:left="340"/>
+      </w:pPr>
+      <w:r>
+        <w:t xml:space="preserve">2. 点 </w:t>
+      </w:r>
+      <w:r>
+        <w:rPr>
+          <w:b/>
+        </w:rPr>
+        <w:t>保存</w:t>
+      </w:r>
+      <w:r>
+        <w:t xml:space="preserve">，下次打开还是这个音量；点 </w:t>
+      </w:r>
+      <w:r>
+        <w:rPr>
+          <w:b/>
+        </w:rPr>
+        <w:t>取消</w:t>
+      </w:r>
+      <w:r>
+        <w:t>，会退回原来的音量。</w:t>
+      </w:r>
+    </w:p>
+    <w:p>
+      <w:pPr>
+        <w:ind w:left="340"/>
+      </w:pPr>
+      <w:r>
+        <w:t>3. 滑块和数字框一样，</w:t>
+      </w:r>
+      <w:r>
+        <w:rPr>
+          <w:b/>
+        </w:rPr>
+        <w:t>不能用鼠标滚轮改</w:t>
+      </w:r>
+      <w:r>
+        <w:t>，要用鼠标拖动。</w:t>
+      </w:r>
+    </w:p>
+    <w:p>
+      <w:pPr>
+        <w:ind w:left="340"/>
+      </w:pPr>
+      <w:r>
+        <w:t xml:space="preserve">4. </w:t>
+      </w:r>
+      <w:r>
+        <w:rPr>
+          <w:b/>
+        </w:rPr>
+        <w:t>静音</w:t>
+      </w:r>
+      <w:r>
+        <w:t xml:space="preserve"> 还在右键菜单里，用法不变。已经静音时调滑块不会让她出声，设置里也会提示"当前已静音"。</w:t>
+      </w:r>
+    </w:p>
+    <w:p>
+      <w:pPr>
+        <w:keepNext/>
         <w:jc w:val="center"/>
       </w:pPr>
       <w:r>
         <w:drawing>
           <wp:inline xmlns:a="http://schemas.openxmlformats.org/drawingml/2006/main" xmlns:pic="http://schemas.openxmlformats.org/drawingml/2006/picture">
-            <wp:extent cx="3291428" cy="4510285"/>
+            <wp:extent cx="3471428" cy="1008000"/>
             <wp:docPr id="9" name="Picture 9"/>
             <wp:cNvGraphicFramePr>
               <a:graphicFrameLocks noChangeAspect="1"/>
@@ -2416,7 +2677,7 @@
               <a:graphicData uri="http://schemas.openxmlformats.org/drawingml/2006/picture">
                 <pic:pic>
                   <pic:nvPicPr>
-                    <pic:cNvPr id="0" name="c_v3_dialog_full.jpg"/>
+                    <pic:cNvPr id="0" name="c_v120_sens_volume.jpg"/>
                     <pic:cNvPicPr/>
                   </pic:nvPicPr>
                   <pic:blipFill>
@@ -2428,7 +2689,7 @@
                   <pic:spPr>
                     <a:xfrm>
                       <a:off x="0" y="0"/>
-                      <a:ext cx="3291428" cy="4510285"/>
+                      <a:ext cx="3471428" cy="1008000"/>
                     </a:xfrm>
                     <a:prstGeom prst="rect"/>
                   </pic:spPr>
@@ -2449,7 +2710,119 @@
           <w:color w:val="888888"/>
           <w:sz w:val="18"/>
         </w:rPr>
-        <w:t>完整的 FX设置窗口（中间的密钥栏未显示，见第五节；最下面是"恢复数值默认"和保存/取消）</w:t>
+        <w:t>FX设置里"表情灵敏度"下面的音效音量滑块（图中音量是改过的 60%，默认是 30%）</w:t>
+      </w:r>
+    </w:p>
+    <w:p>
+      <w:pPr>
+        <w:pStyle w:val="Heading1"/>
+      </w:pPr>
+      <w:r>
+        <w:t>四、风控小助手</w:t>
+      </w:r>
+    </w:p>
+    <w:p>
+      <w:pPr>
+        <w:pStyle w:val="ListBullet"/>
+      </w:pPr>
+      <w:r>
+        <w:rPr>
+          <w:b/>
+        </w:rPr>
+        <w:t>止损价</w:t>
+      </w:r>
+      <w:r>
+        <w:t xml:space="preserve">：在 FX设置… 里填一个价格，跌破时她会切到恐慌表情，喊"该止损了……真的要止损吗？"。不填就是关闭。窗口最下面的 </w:t>
+      </w:r>
+      <w:r>
+        <w:rPr>
+          <w:b/>
+        </w:rPr>
+        <w:t>恢复数值默认</w:t>
+      </w:r>
+      <w:r>
+        <w:t xml:space="preserve"> 也会把它清空（点完要再点保存）。</w:t>
+      </w:r>
+    </w:p>
+    <w:p>
+      <w:pPr>
+        <w:pStyle w:val="ListBullet"/>
+      </w:pPr>
+      <w:r>
+        <w:rPr>
+          <w:b/>
+        </w:rPr>
+        <w:t>休息提醒</w:t>
+      </w:r>
+      <w:r>
+        <w:t>：连续盯盘 1 小时，她会劝你休息一下。</w:t>
+      </w:r>
+    </w:p>
+    <w:p>
+      <w:pPr>
+        <w:pStyle w:val="ListBullet"/>
+      </w:pPr>
+      <w:r>
+        <w:rPr>
+          <w:b/>
+        </w:rPr>
+        <w:t>今日总结</w:t>
+      </w:r>
+      <w:r>
+        <w:t>：关掉 FX启动！ 时，她会用一句话总结今天的涨跌。这是以今天首次读到的价格为基准算的，不是交易所公布的日涨跌。</w:t>
+      </w:r>
+    </w:p>
+    <w:p>
+      <w:pPr>
+        <w:keepNext/>
+        <w:jc w:val="center"/>
+      </w:pPr>
+      <w:r>
+        <w:drawing>
+          <wp:inline xmlns:a="http://schemas.openxmlformats.org/drawingml/2006/main" xmlns:pic="http://schemas.openxmlformats.org/drawingml/2006/picture">
+            <wp:extent cx="3291428" cy="5173713"/>
+            <wp:docPr id="10" name="Picture 10"/>
+            <wp:cNvGraphicFramePr>
+              <a:graphicFrameLocks noChangeAspect="1"/>
+            </wp:cNvGraphicFramePr>
+            <a:graphic>
+              <a:graphicData uri="http://schemas.openxmlformats.org/drawingml/2006/picture">
+                <pic:pic>
+                  <pic:nvPicPr>
+                    <pic:cNvPr id="0" name="c_v120_dialog_full.jpg"/>
+                    <pic:cNvPicPr/>
+                  </pic:nvPicPr>
+                  <pic:blipFill>
+                    <a:blip r:embed="rId18"/>
+                    <a:stretch>
+                      <a:fillRect/>
+                    </a:stretch>
+                  </pic:blipFill>
+                  <pic:spPr>
+                    <a:xfrm>
+                      <a:off x="0" y="0"/>
+                      <a:ext cx="3291428" cy="5173713"/>
+                    </a:xfrm>
+                    <a:prstGeom prst="rect"/>
+                  </pic:spPr>
+                </pic:pic>
+              </a:graphicData>
+            </a:graphic>
+          </wp:inline>
+        </w:drawing>
+      </w:r>
+    </w:p>
+    <w:p>
+      <w:pPr>
+        <w:jc w:val="center"/>
+      </w:pPr>
+      <w:r>
+        <w:rPr>
+          <w:i/>
+          <w:color w:val="888888"/>
+          <w:sz w:val="18"/>
+        </w:rPr>
+        <w:t>完整的 FX设置窗口（中间的密钥栏未显示，见第五节；最下面是"恢复数值默认"和保存/取消。图中音量是改过的 60%，默认是 30%）</w:t>
       </w:r>
     </w:p>
     <w:p>
@@ -2549,13 +2922,14 @@
     </w:p>
     <w:p>
       <w:pPr>
+        <w:keepNext/>
         <w:jc w:val="center"/>
       </w:pPr>
       <w:r>
         <w:drawing>
           <wp:inline xmlns:a="http://schemas.openxmlformats.org/drawingml/2006/main" xmlns:pic="http://schemas.openxmlformats.org/drawingml/2006/picture">
             <wp:extent cx="5400000" cy="3848354"/>
-            <wp:docPr id="10" name="Picture 10"/>
+            <wp:docPr id="11" name="Picture 11"/>
             <wp:cNvGraphicFramePr>
               <a:graphicFrameLocks noChangeAspect="1"/>
             </wp:cNvGraphicFramePr>
@@ -2567,7 +2941,7 @@
                     <pic:cNvPicPr/>
                   </pic:nvPicPr>
                   <pic:blipFill>
-                    <a:blip r:embed="rId18"/>
+                    <a:blip r:embed="rId19"/>
                     <a:stretch>
                       <a:fillRect/>
                     </a:stretch>
@@ -2642,13 +3016,14 @@
     </w:p>
     <w:p>
       <w:pPr>
+        <w:keepNext/>
         <w:jc w:val="center"/>
       </w:pPr>
       <w:r>
         <w:drawing>
           <wp:inline xmlns:a="http://schemas.openxmlformats.org/drawingml/2006/main" xmlns:pic="http://schemas.openxmlformats.org/drawingml/2006/picture">
             <wp:extent cx="3558857" cy="730286"/>
-            <wp:docPr id="11" name="Picture 11"/>
+            <wp:docPr id="12" name="Picture 12"/>
             <wp:cNvGraphicFramePr>
               <a:graphicFrameLocks noChangeAspect="1"/>
             </wp:cNvGraphicFramePr>
@@ -2660,7 +3035,7 @@
                     <pic:cNvPicPr/>
                   </pic:nvPicPr>
                   <pic:blipFill>
-                    <a:blip r:embed="rId19"/>
+                    <a:blip r:embed="rId20"/>
                     <a:stretch>
                       <a:fillRect/>
                     </a:stretch>
@@ -2805,7 +3180,332 @@
         <w:pStyle w:val="Heading1"/>
       </w:pPr>
       <w:r>
-        <w:t>六、常见问题</w:t>
+        <w:t>六、自动更新（v1.2.0 及以后）</w:t>
+      </w:r>
+    </w:p>
+    <w:p>
+      <w:pPr>
+        <w:pStyle w:val="Heading2"/>
+      </w:pPr>
+      <w:r>
+        <w:t>1. 有新版本时会怎样</w:t>
+      </w:r>
+    </w:p>
+    <w:p>
+      <w:r>
+        <w:t>每次启动时，她会去 GitHub 看看有没有新版本。有的话，会弹出一个粉色小窗口，写着"当前 v旧版本 → 新版 v新版本"，下面是这次更新的说明。没联网或者检查失败时，她不会打扰你。</w:t>
+      </w:r>
+    </w:p>
+    <w:p>
+      <w:pPr>
+        <w:keepNext/>
+        <w:jc w:val="center"/>
+      </w:pPr>
+      <w:r>
+        <w:drawing>
+          <wp:inline xmlns:a="http://schemas.openxmlformats.org/drawingml/2006/main" xmlns:pic="http://schemas.openxmlformats.org/drawingml/2006/picture">
+            <wp:extent cx="2581714" cy="2057143"/>
+            <wp:docPr id="13" name="Picture 13"/>
+            <wp:cNvGraphicFramePr>
+              <a:graphicFrameLocks noChangeAspect="1"/>
+            </wp:cNvGraphicFramePr>
+            <a:graphic>
+              <a:graphicData uri="http://schemas.openxmlformats.org/drawingml/2006/picture">
+                <pic:pic>
+                  <pic:nvPicPr>
+                    <pic:cNvPr id="0" name="c_update_popup.jpg"/>
+                    <pic:cNvPicPr/>
+                  </pic:nvPicPr>
+                  <pic:blipFill>
+                    <a:blip r:embed="rId21"/>
+                    <a:stretch>
+                      <a:fillRect/>
+                    </a:stretch>
+                  </pic:blipFill>
+                  <pic:spPr>
+                    <a:xfrm>
+                      <a:off x="0" y="0"/>
+                      <a:ext cx="2581714" cy="2057143"/>
+                    </a:xfrm>
+                    <a:prstGeom prst="rect"/>
+                  </pic:spPr>
+                </pic:pic>
+              </a:graphicData>
+            </a:graphic>
+          </wp:inline>
+        </w:drawing>
+      </w:r>
+    </w:p>
+    <w:p>
+      <w:pPr>
+        <w:jc w:val="center"/>
+      </w:pPr>
+      <w:r>
+        <w:rPr>
+          <w:i/>
+          <w:color w:val="888888"/>
+          <w:sz w:val="18"/>
+        </w:rPr>
+        <w:t>新版本提示窗口</w:t>
+      </w:r>
+    </w:p>
+    <w:p>
+      <w:r>
+        <w:t>窗口里的按钮：</w:t>
+      </w:r>
+    </w:p>
+    <w:p>
+      <w:pPr>
+        <w:pStyle w:val="ListBullet"/>
+      </w:pPr>
+      <w:r>
+        <w:rPr>
+          <w:b/>
+        </w:rPr>
+        <w:t>更新</w:t>
+      </w:r>
+      <w:r>
+        <w:t>：自动下载、校验、替换并重启。如果新版启动失败，会自动退回旧版。你的配置、密钥和自定义素材都会保留。</w:t>
+      </w:r>
+    </w:p>
+    <w:p>
+      <w:pPr>
+        <w:pStyle w:val="ListBullet"/>
+      </w:pPr>
+      <w:r>
+        <w:rPr>
+          <w:b/>
+        </w:rPr>
+        <w:t>百度网盘</w:t>
+      </w:r>
+      <w:r>
+        <w:t xml:space="preserve"> / </w:t>
+      </w:r>
+      <w:r>
+        <w:rPr>
+          <w:b/>
+        </w:rPr>
+        <w:t>夸克网盘</w:t>
+      </w:r>
+      <w:r>
+        <w:t>：GitHub 下载太慢时，窗口会提示你改用网盘。网盘下载的需要</w:t>
+      </w:r>
+      <w:r>
+        <w:rPr>
+          <w:b/>
+        </w:rPr>
+        <w:t>手动安装</w:t>
+      </w:r>
+      <w:r>
+        <w:t>，下载后请核对文件名里的版本号。</w:t>
+      </w:r>
+    </w:p>
+    <w:p>
+      <w:pPr>
+        <w:pStyle w:val="ListBullet"/>
+      </w:pPr>
+      <w:r>
+        <w:rPr>
+          <w:b/>
+        </w:rPr>
+        <w:t>稍后</w:t>
+      </w:r>
+      <w:r>
+        <w:t>：这次先不更新，下次启动还会提醒。</w:t>
+      </w:r>
+    </w:p>
+    <w:p>
+      <w:pPr>
+        <w:pStyle w:val="ListBullet"/>
+      </w:pPr>
+      <w:r>
+        <w:rPr>
+          <w:b/>
+        </w:rPr>
+        <w:t>跳过此版本</w:t>
+      </w:r>
+      <w:r>
+        <w:t>：这个版本以后不再提醒。出了更新的版本时，还会照常提醒。</w:t>
+      </w:r>
+    </w:p>
+    <w:p>
+      <w:pPr>
+        <w:pStyle w:val="Heading2"/>
+      </w:pPr>
+      <w:r>
+        <w:t>2. 手动安装</w:t>
+      </w:r>
+    </w:p>
+    <w:p>
+      <w:r>
+        <w:t>用网盘下载新版，或者想自己装某个版本时，按下面做：</w:t>
+      </w:r>
+    </w:p>
+    <w:p>
+      <w:pPr>
+        <w:ind w:left="340"/>
+      </w:pPr>
+      <w:r>
+        <w:t xml:space="preserve">1. 右键久留美 → </w:t>
+      </w:r>
+      <w:r>
+        <w:rPr>
+          <w:b/>
+        </w:rPr>
+        <w:t>退出</w:t>
+      </w:r>
+      <w:r>
+        <w:t>。</w:t>
+      </w:r>
+    </w:p>
+    <w:p>
+      <w:pPr>
+        <w:ind w:left="340"/>
+      </w:pPr>
+      <w:r>
+        <w:t xml:space="preserve">2. 下载新版压缩包，文件名类似 </w:t>
+      </w:r>
+      <w:r>
+        <w:rPr>
+          <w:rFonts w:ascii="Consolas" w:hAnsi="Consolas"/>
+        </w:rPr>
+        <w:t>Kurumi-v1.2.0-Windows-x64.zip</w:t>
+      </w:r>
+      <w:r>
+        <w:t>。可以在 GitHub 发布页 https://github.com/Mandarin715/kurumi-desktop-pet/releases 下载，也可以用百度网盘 https://pan.baidu.com/s/1Fuasa1-ZIbr1AAknZswXqA?pwd=g64g 或夸克网盘 https://pan.quark.cn/s/3d36119ca037 。</w:t>
+      </w:r>
+    </w:p>
+    <w:p>
+      <w:pPr>
+        <w:ind w:left="340"/>
+      </w:pPr>
+      <w:r>
+        <w:t xml:space="preserve">3. 解压，会得到一个 </w:t>
+      </w:r>
+      <w:r>
+        <w:rPr>
+          <w:rFonts w:ascii="Consolas" w:hAnsi="Consolas"/>
+        </w:rPr>
+        <w:t>Kurumi</w:t>
+      </w:r>
+      <w:r>
+        <w:t xml:space="preserve"> 文件夹。</w:t>
+      </w:r>
+    </w:p>
+    <w:p>
+      <w:pPr>
+        <w:ind w:left="340"/>
+      </w:pPr>
+      <w:r>
+        <w:t xml:space="preserve">4. </w:t>
+      </w:r>
+      <w:r>
+        <w:rPr>
+          <w:b/>
+        </w:rPr>
+        <w:t>把旧文件夹里的个人文件复制到新文件夹里</w:t>
+      </w:r>
+      <w:r>
+        <w:t>，覆盖同名文件：</w:t>
+      </w:r>
+    </w:p>
+    <w:p>
+      <w:pPr>
+        <w:pStyle w:val="ListBullet"/>
+      </w:pPr>
+      <w:r>
+        <w:rPr>
+          <w:rFonts w:ascii="Consolas" w:hAnsi="Consolas"/>
+        </w:rPr>
+        <w:t>kurumi.json</w:t>
+      </w:r>
+      <w:r>
+        <w:t xml:space="preserve">：你的设置（数据源、灵敏度、交易对、音量等）。新压缩包里也带了一份默认的 </w:t>
+      </w:r>
+      <w:r>
+        <w:rPr>
+          <w:rFonts w:ascii="Consolas" w:hAnsi="Consolas"/>
+        </w:rPr>
+        <w:t>kurumi.json</w:t>
+      </w:r>
+      <w:r>
+        <w:t>，一定要用你自己的覆盖它，不然设置会变回默认。</w:t>
+      </w:r>
+    </w:p>
+    <w:p>
+      <w:pPr>
+        <w:pStyle w:val="ListBullet"/>
+      </w:pPr>
+      <w:r>
+        <w:rPr>
+          <w:rFonts w:ascii="Consolas" w:hAnsi="Consolas"/>
+        </w:rPr>
+        <w:t>okx.local.json</w:t>
+      </w:r>
+      <w:r>
+        <w:t>：你的 API 密钥（只有填过密钥才有）。新压缩包里没有这个文件。</w:t>
+      </w:r>
+    </w:p>
+    <w:p>
+      <w:pPr>
+        <w:pStyle w:val="ListBullet"/>
+      </w:pPr>
+      <w:r>
+        <w:t xml:space="preserve">如果你自己换过 </w:t>
+      </w:r>
+      <w:r>
+        <w:rPr>
+          <w:rFonts w:ascii="Consolas" w:hAnsi="Consolas"/>
+        </w:rPr>
+        <w:t>assets</w:t>
+      </w:r>
+      <w:r>
+        <w:t xml:space="preserve"> 文件夹里的图片或音效，也一起复制过去。</w:t>
+      </w:r>
+    </w:p>
+    <w:p>
+      <w:pPr>
+        <w:ind w:left="340"/>
+      </w:pPr>
+      <w:r>
+        <w:t xml:space="preserve">5. 双击新文件夹里的 </w:t>
+      </w:r>
+      <w:r>
+        <w:rPr>
+          <w:rFonts w:ascii="Consolas" w:hAnsi="Consolas"/>
+        </w:rPr>
+        <w:t>Kurumi.exe</w:t>
+      </w:r>
+      <w:r>
+        <w:t>。确认一切正常后，再删除旧文件夹。</w:t>
+      </w:r>
+    </w:p>
+    <w:p>
+      <w:r>
+        <w:rPr>
+          <w:b/>
+        </w:rPr>
+        <w:t>注意：</w:t>
+      </w:r>
+      <w:r>
+        <w:t xml:space="preserve">不要直接把新压缩包里的东西整个拖进旧文件夹覆盖，这样会把你的 </w:t>
+      </w:r>
+      <w:r>
+        <w:rPr>
+          <w:rFonts w:ascii="Consolas" w:hAnsi="Consolas"/>
+        </w:rPr>
+        <w:t>kurumi.json</w:t>
+      </w:r>
+      <w:r>
+        <w:t xml:space="preserve"> 换成默认设置。手填的止损价和静音开关记在电脑里，不受影响。</w:t>
+      </w:r>
+    </w:p>
+    <w:p>
+      <w:pPr>
+        <w:pStyle w:val="Heading1"/>
+      </w:pPr>
+      <w:r>
+        <w:t>七、常见问题</w:t>
       </w:r>
     </w:p>
     <w:p>
@@ -2934,12 +3634,143 @@
         <w:rPr>
           <w:b/>
         </w:rPr>
-        <w:t>Q：滚轮改不了 FX设置 里的数字？</w:t>
+        <w:t>Q：滚轮改不了 FX设置 里的数字或音量？</w:t>
       </w:r>
     </w:p>
     <w:p>
       <w:r>
-        <w:t>这是故意的，防止滚动页面时误改。请直接输入数字，或者点右边的上下箭头。</w:t>
+        <w:t>这是故意的，防止滚动页面时误改。数字框请直接输入数字，或者点右边的上下箭头；音量请用鼠标拖动滑块。</w:t>
+      </w:r>
+    </w:p>
+    <w:p>
+      <w:r>
+        <w:rPr>
+          <w:b/>
+        </w:rPr>
+        <w:t>Q：怎么一直没有更新提示？</w:t>
+      </w:r>
+    </w:p>
+    <w:p>
+      <w:pPr>
+        <w:pStyle w:val="ListBullet"/>
+      </w:pPr>
+      <w:r>
+        <w:t>没联网，或者连不上 GitHub：检查失败时她不会提示，可以直接去网盘下载，手动安装。</w:t>
+      </w:r>
+    </w:p>
+    <w:p>
+      <w:pPr>
+        <w:pStyle w:val="ListBullet"/>
+      </w:pPr>
+      <w:r>
+        <w:t>你点过"跳过此版本"：这个版本不会再提醒，出了更新的版本才会提醒。想现在装这个版本，就去网盘或 GitHub 下载，手动安装。</w:t>
+      </w:r>
+    </w:p>
+    <w:p>
+      <w:pPr>
+        <w:pStyle w:val="ListBullet"/>
+      </w:pPr>
+      <w:r>
+        <w:t>已经是最新版：没有新版本自然不会提醒。</w:t>
+      </w:r>
+    </w:p>
+    <w:p>
+      <w:r>
+        <w:rPr>
+          <w:b/>
+        </w:rPr>
+        <w:t>Q：自动更新失败了怎么办？</w:t>
+      </w:r>
+    </w:p>
+    <w:p>
+      <w:pPr>
+        <w:pStyle w:val="ListBullet"/>
+      </w:pPr>
+      <w:r>
+        <w:t>如果新版没能正常启动，她会自动退回旧版，你的配置和密钥不受影响。</w:t>
+      </w:r>
+    </w:p>
+    <w:p>
+      <w:pPr>
+        <w:pStyle w:val="ListBullet"/>
+      </w:pPr>
+      <w:r>
+        <w:t xml:space="preserve">窗口里会显示原因，可以点 </w:t>
+      </w:r>
+      <w:r>
+        <w:rPr>
+          <w:b/>
+        </w:rPr>
+        <w:t>重试更新</w:t>
+      </w:r>
+      <w:r>
+        <w:t xml:space="preserve">，或者点 </w:t>
+      </w:r>
+      <w:r>
+        <w:rPr>
+          <w:b/>
+        </w:rPr>
+        <w:t>百度网盘</w:t>
+      </w:r>
+      <w:r>
+        <w:t xml:space="preserve"> / </w:t>
+      </w:r>
+      <w:r>
+        <w:rPr>
+          <w:b/>
+        </w:rPr>
+        <w:t>夸克网盘</w:t>
+      </w:r>
+      <w:r>
+        <w:t xml:space="preserve"> 下载，然后按第六节手动安装。</w:t>
+      </w:r>
+    </w:p>
+    <w:p>
+      <w:pPr>
+        <w:pStyle w:val="ListBullet"/>
+      </w:pPr>
+      <w:r>
+        <w:t>GitHub 下载太慢时，窗口也会提示你改用网盘。</w:t>
+      </w:r>
+    </w:p>
+    <w:p>
+      <w:r>
+        <w:rPr>
+          <w:b/>
+        </w:rPr>
+        <w:t>Q：音效太吵或者太小？</w:t>
+      </w:r>
+    </w:p>
+    <w:p>
+      <w:r>
+        <w:t xml:space="preserve">在 </w:t>
+      </w:r>
+      <w:r>
+        <w:rPr>
+          <w:b/>
+        </w:rPr>
+        <w:t>FX设置… → 音效音量</w:t>
+      </w:r>
+      <w:r>
+        <w:t xml:space="preserve"> 里拖动滑块，马上就能听到效果，满意后点 </w:t>
+      </w:r>
+      <w:r>
+        <w:rPr>
+          <w:b/>
+        </w:rPr>
+        <w:t>保存</w:t>
+      </w:r>
+      <w:r>
+        <w:t xml:space="preserve">。完全不想听就右键 → </w:t>
+      </w:r>
+      <w:r>
+        <w:rPr>
+          <w:b/>
+        </w:rPr>
+        <w:t>静音</w:t>
+      </w:r>
+      <w:r>
+        <w:t>。</w:t>
       </w:r>
     </w:p>
     <w:p>
@@ -2974,7 +3805,16 @@
         <w:t>欧易 OKX API</w:t>
       </w:r>
       <w:r>
-        <w:t xml:space="preserve"> 下能用。右键 → 行情数据源 → 选 </w:t>
+        <w:t xml:space="preserve"> 下能用。先关掉 FX设置，然后右键 → </w:t>
+      </w:r>
+      <w:r>
+        <w:rPr>
+          <w:b/>
+        </w:rPr>
+        <w:t>行情数据源</w:t>
+      </w:r>
+      <w:r>
+        <w:t xml:space="preserve"> → 选 </w:t>
       </w:r>
       <w:r>
         <w:rPr>
@@ -2983,7 +3823,29 @@
         <w:t>欧易 OKX API</w:t>
       </w:r>
       <w:r>
-        <w:t xml:space="preserve"> 就可以了。</w:t>
+        <w:t>，再打开 FX设置 就能选了。数据源不在 FX设置 里切换。</w:t>
+      </w:r>
+    </w:p>
+    <w:p>
+      <w:r>
+        <w:rPr>
+          <w:b/>
+        </w:rPr>
+        <w:t>Q：选了 XPERP，为什么找不到普通的交割合约或期权？</w:t>
+      </w:r>
+    </w:p>
+    <w:p>
+      <w:r>
+        <w:t xml:space="preserve">XPERP 这一项只列出代码里带 </w:t>
+      </w:r>
+      <w:r>
+        <w:rPr>
+          <w:rFonts w:ascii="Consolas" w:hAnsi="Consolas"/>
+        </w:rPr>
+        <w:t>_UM_XPERP</w:t>
+      </w:r>
+      <w:r>
+        <w:t xml:space="preserve"> 的品种。普通交割合约和期权不在列表里，手动输入也保存不了。现货、永续照常可以选。</w:t>
       </w:r>
     </w:p>
     <w:p>
@@ -3114,7 +3976,7 @@
         <w:t>恢复数值默认</w:t>
       </w:r>
       <w:r>
-        <w:t xml:space="preserve"> 也行，但它还会把两条 3% 提醒线恢复成默认，并清空手动填的止损价。）</w:t>
+        <w:t xml:space="preserve"> 也行，但它还会把音量恢复成 30%、两条 3% 提醒线恢复成默认，并清空手动填的止损价。）</w:t>
       </w:r>
     </w:p>
     <w:sectPr>

</xml_diff>